<commit_message>
Update resume March 2026
</commit_message>
<xml_diff>
--- a/Cory Starks Resume.docx
+++ b/Cory Starks Resume.docx
@@ -7,12 +7,12 @@
         <w:tblStyle w:val="TableGrid"/>
         <w:tblW w:w="10917" w:type="dxa"/>
         <w:tblBorders>
-          <w:top w:val="none" w:sz="12" w:space="0" w:color="000000" w:themeColor="text1"/>
-          <w:left w:val="none" w:sz="12" w:space="0" w:color="000000" w:themeColor="text1"/>
-          <w:bottom w:val="none" w:sz="12" w:space="0" w:color="000000" w:themeColor="text1"/>
-          <w:right w:val="none" w:sz="12" w:space="0" w:color="000000" w:themeColor="text1"/>
-          <w:insideH w:val="none" w:sz="12" w:space="0" w:color="000000" w:themeColor="text1"/>
-          <w:insideV w:val="none" w:sz="12" w:space="0" w:color="000000" w:themeColor="text1"/>
+          <w:top w:val="none" w:color="000000" w:themeColor="text1" w:sz="12" w:space="0"/>
+          <w:left w:val="none" w:color="000000" w:themeColor="text1" w:sz="12" w:space="0"/>
+          <w:bottom w:val="none" w:color="000000" w:themeColor="text1" w:sz="12" w:space="0"/>
+          <w:right w:val="none" w:color="000000" w:themeColor="text1" w:sz="12" w:space="0"/>
+          <w:insideH w:val="none" w:color="000000" w:themeColor="text1" w:sz="12" w:space="0"/>
+          <w:insideV w:val="none" w:color="000000" w:themeColor="text1" w:sz="12" w:space="0"/>
         </w:tblBorders>
         <w:tblLayout w:type="fixed"/>
         <w:tblLook w:val="06A0" w:firstRow="1" w:lastRow="0" w:firstColumn="1" w:lastColumn="0" w:noHBand="1" w:noVBand="1"/>
@@ -23,17 +23,18 @@
       </w:tblGrid>
       <w:tr>
         <w:trPr>
-          <w:trHeight w:val="1080"/>
+          <w:trHeight w:val="1200"/>
         </w:trPr>
         <w:tc>
           <w:tcPr>
             <w:tcW w:w="3960" w:type="dxa"/>
             <w:tcBorders>
-              <w:top w:val="none" w:sz="12" w:space="0" w:color="000000" w:themeColor="text1"/>
-              <w:left w:val="none" w:sz="2" w:space="0" w:color="000000" w:themeColor="text1"/>
-              <w:bottom w:val="none" w:sz="12" w:space="0" w:color="000000" w:themeColor="text1"/>
-              <w:right w:val="none" w:sz="12" w:space="0" w:color="000000" w:themeColor="text1"/>
+              <w:top w:val="none" w:color="000000" w:themeColor="text1" w:sz="12" w:space="0"/>
+              <w:left w:val="none" w:color="000000" w:themeColor="text1" w:sz="2" w:space="0"/>
+              <w:bottom w:val="none" w:color="000000" w:themeColor="text1" w:sz="12" w:space="0"/>
+              <w:right w:val="none" w:color="000000" w:themeColor="text1" w:sz="12" w:space="0"/>
             </w:tcBorders>
+            <w:tcMar/>
           </w:tcPr>
           <w:p>
             <w:pPr>
@@ -108,11 +109,12 @@
           <w:tcPr>
             <w:tcW w:w="6957" w:type="dxa"/>
             <w:tcBorders>
-              <w:top w:val="none" w:sz="12" w:space="0" w:color="000000" w:themeColor="text1"/>
-              <w:left w:val="none" w:sz="2" w:space="0" w:color="000000" w:themeColor="text1"/>
-              <w:bottom w:val="none" w:sz="12" w:space="0" w:color="000000" w:themeColor="text1"/>
-              <w:right w:val="none" w:sz="12" w:space="0" w:color="000000" w:themeColor="text1"/>
+              <w:top w:val="none" w:color="000000" w:themeColor="text1" w:sz="12" w:space="0"/>
+              <w:left w:val="none" w:color="000000" w:themeColor="text1" w:sz="2" w:space="0"/>
+              <w:bottom w:val="none" w:color="000000" w:themeColor="text1" w:sz="12" w:space="0"/>
+              <w:right w:val="none" w:color="000000" w:themeColor="text1" w:sz="12" w:space="0"/>
             </w:tcBorders>
+            <w:tcMar/>
           </w:tcPr>
           <w:p>
             <w:pPr>
@@ -144,7 +146,7 @@
     <w:p>
       <w:pPr>
         <w:pBdr>
-          <w:bottom w:val="single" w:sz="12" w:space="1" w:color="000000"/>
+          <w:bottom w:val="single" w:color="000000" w:sz="12" w:space="1"/>
         </w:pBdr>
         <w:spacing w:before="240" w:after="120" w:line="276" w:lineRule="auto"/>
         <w:rPr>
@@ -168,18 +170,19 @@
     </w:p>
     <w:p>
       <w:pPr>
-        <w:spacing w:line="240" w:lineRule="auto"/>
-        <w:rPr>
-          <w:rFonts w:eastAsia="Arial" w:cs="Arial"/>
-          <w:sz w:val="20"/>
-          <w:szCs w:val="20"/>
-        </w:rPr>
-      </w:pPr>
-      <w:r>
-        <w:rPr>
-          <w:rFonts w:eastAsia="Arial" w:cs="Arial"/>
-          <w:b/>
-          <w:bCs/>
+        <w:pStyle w:val="Normal"/>
+        <w:spacing w:after="100" w:afterAutospacing="off" w:line="240" w:lineRule="auto"/>
+        <w:rPr>
+          <w:rFonts w:eastAsia="Arial" w:cs="Arial"/>
+          <w:sz w:val="20"/>
+          <w:szCs w:val="20"/>
+        </w:rPr>
+      </w:pPr>
+      <w:r>
+        <w:rPr>
+          <w:rFonts w:eastAsia="Arial" w:cs="Arial"/>
+          <w:b w:val="1"/>
+          <w:bCs w:val="1"/>
           <w:sz w:val="20"/>
           <w:szCs w:val="20"/>
         </w:rPr>
@@ -188,8 +191,8 @@
       <w:r>
         <w:rPr>
           <w:rFonts w:eastAsia="Arial" w:cs="Arial"/>
-          <w:i/>
-          <w:iCs/>
+          <w:i w:val="1"/>
+          <w:iCs w:val="1"/>
           <w:sz w:val="20"/>
           <w:szCs w:val="20"/>
         </w:rPr>
@@ -201,23 +204,48 @@
           <w:sz w:val="20"/>
           <w:szCs w:val="20"/>
         </w:rPr>
-        <w:t>Java, Python, Shell, C#, C++, C</w:t>
+        <w:t>Java</w:t>
+      </w:r>
+      <w:r>
+        <w:rPr>
+          <w:rFonts w:eastAsia="Arial" w:cs="Arial"/>
+          <w:sz w:val="20"/>
+          <w:szCs w:val="20"/>
+        </w:rPr>
+        <w:t>, C++, C, C#</w:t>
+      </w:r>
+      <w:r>
+        <w:rPr>
+          <w:rFonts w:eastAsia="Arial" w:cs="Arial"/>
+          <w:sz w:val="20"/>
+          <w:szCs w:val="20"/>
+        </w:rPr>
+        <w:t>, Dart</w:t>
+      </w:r>
+      <w:r>
+        <w:rPr>
+          <w:rFonts w:eastAsia="Arial" w:cs="Arial"/>
+          <w:sz w:val="20"/>
+          <w:szCs w:val="20"/>
+        </w:rPr>
+        <w:t>, Python, Shell</w:t>
       </w:r>
     </w:p>
     <w:p>
       <w:pPr>
-        <w:spacing w:line="240" w:lineRule="auto"/>
-        <w:rPr>
-          <w:rFonts w:eastAsia="Arial" w:cs="Arial"/>
-          <w:sz w:val="20"/>
-          <w:szCs w:val="20"/>
-        </w:rPr>
-      </w:pPr>
-      <w:r>
-        <w:rPr>
-          <w:rFonts w:eastAsia="Arial" w:cs="Arial"/>
-          <w:b/>
-          <w:bCs/>
+        <w:pStyle w:val="Normal"/>
+        <w:spacing w:after="100" w:afterAutospacing="off" w:line="240" w:lineRule="auto"/>
+        <w:rPr>
+          <w:rFonts w:eastAsia="Arial" w:cs="Arial"/>
+          <w:sz w:val="20"/>
+          <w:szCs w:val="20"/>
+        </w:rPr>
+      </w:pPr>
+      <w:r>
+        <w:rPr>
+          <w:rFonts w:eastAsia="Arial" w:cs="Arial"/>
+          <w:b w:val="1"/>
+          <w:bCs w:val="1"/>
           <w:sz w:val="20"/>
           <w:szCs w:val="20"/>
         </w:rPr>
@@ -226,8 +254,8 @@
       <w:r>
         <w:rPr>
           <w:rFonts w:eastAsia="Arial" w:cs="Arial"/>
-          <w:b/>
-          <w:bCs/>
+          <w:b w:val="1"/>
+          <w:bCs w:val="1"/>
           <w:sz w:val="20"/>
           <w:szCs w:val="20"/>
         </w:rPr>
@@ -236,26 +264,84 @@
       <w:r>
         <w:rPr>
           <w:rFonts w:eastAsia="Arial" w:cs="Arial"/>
-          <w:sz w:val="20"/>
-          <w:szCs w:val="20"/>
-        </w:rPr>
-        <w:t>Java CDI, Maven, Docker, Django</w:t>
-      </w:r>
-      <w:r>
-        <w:rPr>
-          <w:rFonts w:eastAsia="Arial" w:cs="Arial"/>
-          <w:sz w:val="20"/>
-          <w:szCs w:val="20"/>
-        </w:rPr>
-        <w:t>, REST</w:t>
-      </w:r>
-      <w:r>
-        <w:rPr>
-          <w:rFonts w:eastAsia="Arial" w:cs="Arial"/>
-          <w:sz w:val="20"/>
-          <w:szCs w:val="20"/>
-        </w:rPr>
-        <w:t>, Git</w:t>
+          <w:i w:val="1"/>
+          <w:iCs w:val="1"/>
+          <w:sz w:val="20"/>
+          <w:szCs w:val="20"/>
+        </w:rPr>
+        <w:t xml:space="preserve"> </w:t>
+      </w:r>
+      <w:r>
+        <w:rPr>
+          <w:rFonts w:eastAsia="Arial" w:cs="Arial"/>
+          <w:sz w:val="20"/>
+          <w:szCs w:val="20"/>
+        </w:rPr>
+        <w:t xml:space="preserve">Java </w:t>
+      </w:r>
+      <w:r>
+        <w:rPr>
+          <w:rFonts w:eastAsia="Arial" w:cs="Arial"/>
+          <w:sz w:val="20"/>
+          <w:szCs w:val="20"/>
+        </w:rPr>
+        <w:t xml:space="preserve">25, Claude Code, </w:t>
+      </w:r>
+      <w:r>
+        <w:rPr>
+          <w:rFonts w:eastAsia="Arial" w:cs="Arial"/>
+          <w:sz w:val="20"/>
+          <w:szCs w:val="20"/>
+        </w:rPr>
+        <w:t>Open</w:t>
+      </w:r>
+      <w:r>
+        <w:rPr>
+          <w:rFonts w:eastAsia="Arial" w:cs="Arial"/>
+          <w:sz w:val="20"/>
+          <w:szCs w:val="20"/>
+        </w:rPr>
+        <w:t>C</w:t>
+      </w:r>
+      <w:r>
+        <w:rPr>
+          <w:rFonts w:eastAsia="Arial" w:cs="Arial"/>
+          <w:sz w:val="20"/>
+          <w:szCs w:val="20"/>
+        </w:rPr>
+        <w:t>law</w:t>
+      </w:r>
+      <w:r>
+        <w:rPr>
+          <w:rFonts w:eastAsia="Arial" w:cs="Arial"/>
+          <w:sz w:val="20"/>
+          <w:szCs w:val="20"/>
+        </w:rPr>
+        <w:t>, Flutter, iOS, Android, Firebase, Cloud Functions</w:t>
+      </w:r>
+      <w:r>
+        <w:rPr>
+          <w:rFonts w:eastAsia="Arial" w:cs="Arial"/>
+          <w:sz w:val="20"/>
+          <w:szCs w:val="20"/>
+        </w:rPr>
+        <w:t>, Maven, Docker</w:t>
+      </w:r>
+      <w:r>
+        <w:rPr>
+          <w:rFonts w:eastAsia="Arial" w:cs="Arial"/>
+          <w:sz w:val="20"/>
+          <w:szCs w:val="20"/>
+        </w:rPr>
+        <w:t xml:space="preserve">, </w:t>
+      </w:r>
+      <w:r>
+        <w:rPr>
+          <w:rFonts w:eastAsia="Arial" w:cs="Arial"/>
+          <w:sz w:val="20"/>
+          <w:szCs w:val="20"/>
+        </w:rPr>
+        <w:t>Podman</w:t>
       </w:r>
       <w:r>
         <w:rPr>
@@ -279,47 +365,63 @@
           <w:sz w:val="20"/>
           <w:szCs w:val="20"/>
         </w:rPr>
-        <w:t>Bootstrap, J</w:t>
-      </w:r>
-      <w:r>
-        <w:rPr>
-          <w:rFonts w:eastAsia="Arial" w:cs="Arial"/>
-          <w:sz w:val="20"/>
-          <w:szCs w:val="20"/>
-        </w:rPr>
-        <w:t>SON</w:t>
-      </w:r>
-      <w:r>
-        <w:rPr>
-          <w:rFonts w:eastAsia="Arial" w:cs="Arial"/>
-          <w:sz w:val="20"/>
-          <w:szCs w:val="20"/>
-        </w:rPr>
-        <w:t>, XML</w:t>
-      </w:r>
-      <w:r>
-        <w:rPr>
-          <w:rFonts w:eastAsia="Arial" w:cs="Arial"/>
-          <w:sz w:val="20"/>
-          <w:szCs w:val="20"/>
-        </w:rPr>
-        <w:t>, JavaFX, Linux, Apache Kafka, Netty, SQL, Junit, GCP, GPT API, .NET, Windows/PowerShell, RHEL</w:t>
+        <w:t>RevenueCat</w:t>
+      </w:r>
+      <w:r>
+        <w:rPr>
+          <w:rFonts w:eastAsia="Arial" w:cs="Arial"/>
+          <w:sz w:val="20"/>
+          <w:szCs w:val="20"/>
+        </w:rPr>
+        <w:t>, Git, JavaFX</w:t>
+      </w:r>
+      <w:r>
+        <w:rPr>
+          <w:rFonts w:eastAsia="Arial" w:cs="Arial"/>
+          <w:sz w:val="20"/>
+          <w:szCs w:val="20"/>
+        </w:rPr>
+        <w:t>, Junit</w:t>
+      </w:r>
+      <w:r>
+        <w:rPr>
+          <w:rFonts w:eastAsia="Arial" w:cs="Arial"/>
+          <w:sz w:val="20"/>
+          <w:szCs w:val="20"/>
+        </w:rPr>
+        <w:t>, Linux</w:t>
+      </w:r>
+      <w:r>
+        <w:rPr>
+          <w:rFonts w:eastAsia="Arial" w:cs="Arial"/>
+          <w:sz w:val="20"/>
+          <w:szCs w:val="20"/>
+        </w:rPr>
+        <w:t>, RHEL</w:t>
+      </w:r>
+      <w:r>
+        <w:rPr>
+          <w:rFonts w:eastAsia="Arial" w:cs="Arial"/>
+          <w:sz w:val="20"/>
+          <w:szCs w:val="20"/>
+        </w:rPr>
+        <w:t>, Apache Kafka, Netty, SQL, GCP, GPT API</w:t>
       </w:r>
     </w:p>
     <w:p>
       <w:pPr>
-        <w:spacing w:line="240" w:lineRule="auto"/>
-        <w:rPr>
-          <w:rFonts w:eastAsia="Arial" w:cs="Arial"/>
-          <w:sz w:val="20"/>
-          <w:szCs w:val="20"/>
-        </w:rPr>
-      </w:pPr>
-      <w:r>
-        <w:rPr>
-          <w:rFonts w:eastAsia="Arial" w:cs="Arial"/>
-          <w:b/>
-          <w:bCs/>
+        <w:spacing w:after="120" w:afterAutospacing="off" w:line="240" w:lineRule="auto"/>
+        <w:rPr>
+          <w:rFonts w:eastAsia="Arial" w:cs="Arial"/>
+          <w:sz w:val="20"/>
+          <w:szCs w:val="20"/>
+        </w:rPr>
+      </w:pPr>
+      <w:r>
+        <w:rPr>
+          <w:rFonts w:eastAsia="Arial" w:cs="Arial"/>
+          <w:b w:val="1"/>
+          <w:bCs w:val="1"/>
           <w:sz w:val="20"/>
           <w:szCs w:val="20"/>
         </w:rPr>
@@ -328,8 +430,8 @@
       <w:r>
         <w:rPr>
           <w:rFonts w:eastAsia="Arial" w:cs="Arial"/>
-          <w:b/>
-          <w:bCs/>
+          <w:b w:val="1"/>
+          <w:bCs w:val="1"/>
           <w:sz w:val="20"/>
           <w:szCs w:val="20"/>
         </w:rPr>
@@ -346,8 +448,8 @@
       <w:r>
         <w:rPr>
           <w:rFonts w:eastAsia="Arial" w:cs="Arial"/>
-          <w:i/>
-          <w:iCs/>
+          <w:i w:val="1"/>
+          <w:iCs w:val="1"/>
           <w:sz w:val="20"/>
           <w:szCs w:val="20"/>
         </w:rPr>
@@ -367,13 +469,13 @@
           <w:sz w:val="20"/>
           <w:szCs w:val="20"/>
         </w:rPr>
-        <w:t>, Visual Studio Code, Visual Studio, VMware Workstation, VNC Viewer, Chat GPT</w:t>
+        <w:t>, Visual Studio Code, Visual Studio, VMware Workstation, VNC Viewer</w:t>
       </w:r>
     </w:p>
     <w:p>
       <w:pPr>
         <w:pBdr>
-          <w:bottom w:val="single" w:sz="12" w:space="1" w:color="000000"/>
+          <w:bottom w:val="single" w:color="000000" w:sz="12" w:space="1"/>
         </w:pBdr>
         <w:rPr>
           <w:rFonts w:eastAsia="Times New Roman" w:cs="Times New Roman"/>
@@ -397,12 +499,12 @@
         <w:tblStyle w:val="TableGrid"/>
         <w:tblW w:w="10924" w:type="dxa"/>
         <w:tblBorders>
-          <w:top w:val="none" w:sz="12" w:space="0" w:color="000000" w:themeColor="text1"/>
-          <w:left w:val="none" w:sz="12" w:space="0" w:color="000000" w:themeColor="text1"/>
-          <w:bottom w:val="none" w:sz="12" w:space="0" w:color="000000" w:themeColor="text1"/>
-          <w:right w:val="none" w:sz="12" w:space="0" w:color="000000" w:themeColor="text1"/>
-          <w:insideH w:val="none" w:sz="12" w:space="0" w:color="000000" w:themeColor="text1"/>
-          <w:insideV w:val="none" w:sz="12" w:space="0" w:color="000000" w:themeColor="text1"/>
+          <w:top w:val="none" w:color="000000" w:themeColor="text1" w:sz="12" w:space="0"/>
+          <w:left w:val="none" w:color="000000" w:themeColor="text1" w:sz="12" w:space="0"/>
+          <w:bottom w:val="none" w:color="000000" w:themeColor="text1" w:sz="12" w:space="0"/>
+          <w:right w:val="none" w:color="000000" w:themeColor="text1" w:sz="12" w:space="0"/>
+          <w:insideH w:val="none" w:color="000000" w:themeColor="text1" w:sz="12" w:space="0"/>
+          <w:insideV w:val="none" w:color="000000" w:themeColor="text1" w:sz="12" w:space="0"/>
         </w:tblBorders>
         <w:tblLayout w:type="fixed"/>
         <w:tblLook w:val="06A0" w:firstRow="1" w:lastRow="0" w:firstColumn="1" w:lastColumn="0" w:noHBand="1" w:noVBand="1"/>
@@ -418,6 +520,7 @@
         <w:tc>
           <w:tcPr>
             <w:tcW w:w="5883" w:type="dxa"/>
+            <w:tcMar/>
           </w:tcPr>
           <w:p>
             <w:pPr>
@@ -444,6 +547,7 @@
         <w:tc>
           <w:tcPr>
             <w:tcW w:w="5041" w:type="dxa"/>
+            <w:tcMar/>
             <w:vAlign w:val="center"/>
           </w:tcPr>
           <w:p>
@@ -477,6 +581,7 @@
         <w:tc>
           <w:tcPr>
             <w:tcW w:w="5883" w:type="dxa"/>
+            <w:tcMar/>
           </w:tcPr>
           <w:p>
             <w:pPr>
@@ -503,6 +608,7 @@
         <w:tc>
           <w:tcPr>
             <w:tcW w:w="5041" w:type="dxa"/>
+            <w:tcMar/>
             <w:vAlign w:val="center"/>
           </w:tcPr>
           <w:p>
@@ -537,7 +643,7 @@
           <w:ilvl w:val="0"/>
           <w:numId w:val="4"/>
         </w:numPr>
-        <w:spacing w:after="120"/>
+        <w:spacing w:after="120" w:afterAutospacing="off"/>
         <w:ind w:left="360"/>
         <w:rPr>
           <w:rFonts w:eastAsia="Arial" w:cs="Arial"/>
@@ -561,7 +667,7 @@
           <w:ilvl w:val="0"/>
           <w:numId w:val="4"/>
         </w:numPr>
-        <w:spacing w:after="120"/>
+        <w:spacing w:after="120" w:afterAutospacing="off"/>
         <w:ind w:left="360"/>
         <w:rPr>
           <w:rFonts w:eastAsia="Arial" w:cs="Arial"/>
@@ -575,7 +681,23 @@
           <w:sz w:val="20"/>
           <w:szCs w:val="20"/>
         </w:rPr>
-        <w:t>Refactored the Kafka message bus architecture, reducing the API scope by 80% and decreasing latency to ~1 ms</w:t>
+        <w:t xml:space="preserve">Refactored a legacy </w:t>
+      </w:r>
+      <w:r>
+        <w:rPr>
+          <w:rFonts w:eastAsia="Arial" w:cs="Arial"/>
+          <w:sz w:val="20"/>
+          <w:szCs w:val="20"/>
+        </w:rPr>
+        <w:t>component</w:t>
+      </w:r>
+      <w:r>
+        <w:rPr>
+          <w:rFonts w:eastAsia="Arial" w:cs="Arial"/>
+          <w:sz w:val="20"/>
+          <w:szCs w:val="20"/>
+        </w:rPr>
+        <w:t>, cutting 85% of code while migrating to a more maintainable modular architecture.</w:t>
       </w:r>
     </w:p>
     <w:p>
@@ -585,7 +707,7 @@
           <w:ilvl w:val="0"/>
           <w:numId w:val="4"/>
         </w:numPr>
-        <w:spacing w:after="120"/>
+        <w:spacing w:after="120" w:afterAutospacing="off"/>
         <w:ind w:left="360"/>
         <w:rPr>
           <w:rFonts w:eastAsia="Arial" w:cs="Arial"/>
@@ -599,7 +721,63 @@
           <w:sz w:val="20"/>
           <w:szCs w:val="20"/>
         </w:rPr>
-        <w:t>Engineered RF data visualization systems capable of operating displays at a 60hz refresh rate using JavaFX/Netty</w:t>
+        <w:t>Rest</w:t>
+      </w:r>
+      <w:r>
+        <w:rPr>
+          <w:rFonts w:eastAsia="Arial" w:cs="Arial"/>
+          <w:sz w:val="20"/>
+          <w:szCs w:val="20"/>
+        </w:rPr>
+        <w:t>ructured</w:t>
+      </w:r>
+      <w:r>
+        <w:rPr>
+          <w:rFonts w:eastAsia="Arial" w:cs="Arial"/>
+          <w:sz w:val="20"/>
+          <w:szCs w:val="20"/>
+        </w:rPr>
+        <w:t xml:space="preserve"> </w:t>
+      </w:r>
+      <w:r>
+        <w:rPr>
+          <w:rFonts w:eastAsia="Arial" w:cs="Arial"/>
+          <w:sz w:val="20"/>
+          <w:szCs w:val="20"/>
+        </w:rPr>
+        <w:t>the</w:t>
+      </w:r>
+      <w:r>
+        <w:rPr>
+          <w:rFonts w:eastAsia="Arial" w:cs="Arial"/>
+          <w:sz w:val="20"/>
+          <w:szCs w:val="20"/>
+        </w:rPr>
+        <w:t xml:space="preserve"> Kafka message bus architecture, reducing the API scope by 80% and decreasing latency t</w:t>
+      </w:r>
+      <w:r>
+        <w:rPr>
+          <w:rFonts w:eastAsia="Arial" w:cs="Arial"/>
+          <w:sz w:val="20"/>
+          <w:szCs w:val="20"/>
+        </w:rPr>
+        <w:t xml:space="preserve">o </w:t>
+      </w:r>
+      <w:r>
+        <w:rPr>
+          <w:rFonts w:eastAsia="Arial" w:cs="Arial"/>
+          <w:sz w:val="20"/>
+          <w:szCs w:val="20"/>
+        </w:rPr>
+        <w:t xml:space="preserve">~1 </w:t>
+      </w:r>
+      <w:r>
+        <w:rPr>
+          <w:rFonts w:eastAsia="Arial" w:cs="Arial"/>
+          <w:sz w:val="20"/>
+          <w:szCs w:val="20"/>
+        </w:rPr>
+        <w:t>ms</w:t>
       </w:r>
     </w:p>
     <w:p>
@@ -609,7 +787,7 @@
           <w:ilvl w:val="0"/>
           <w:numId w:val="4"/>
         </w:numPr>
-        <w:spacing w:after="120"/>
+        <w:spacing w:after="120" w:afterAutospacing="off"/>
         <w:ind w:left="360"/>
         <w:rPr>
           <w:rFonts w:eastAsia="Arial" w:cs="Arial"/>
@@ -623,7 +801,7 @@
           <w:sz w:val="20"/>
           <w:szCs w:val="20"/>
         </w:rPr>
-        <w:t>Enforced new testing standards and optimized the existing frameworks, increasing code coverage by up to 20%</w:t>
+        <w:t>Engineered RF data visualization systems capable of operating displays at a 60hz refresh rate using JavaFX/Netty</w:t>
       </w:r>
     </w:p>
     <w:p>
@@ -633,7 +811,7 @@
           <w:ilvl w:val="0"/>
           <w:numId w:val="4"/>
         </w:numPr>
-        <w:spacing w:after="120"/>
+        <w:spacing w:after="120" w:afterAutospacing="off"/>
         <w:ind w:left="360"/>
         <w:rPr>
           <w:rFonts w:eastAsia="Arial" w:cs="Arial"/>
@@ -647,7 +825,23 @@
           <w:sz w:val="20"/>
           <w:szCs w:val="20"/>
         </w:rPr>
-        <w:t>Implemented high-level back-end data management processes using CDI, ensuring a scalable/modular code base</w:t>
+        <w:t xml:space="preserve">Enforced new </w:t>
+      </w:r>
+      <w:r>
+        <w:rPr>
+          <w:rFonts w:eastAsia="Arial" w:cs="Arial"/>
+          <w:sz w:val="20"/>
+          <w:szCs w:val="20"/>
+        </w:rPr>
+        <w:t xml:space="preserve">unit </w:t>
+      </w:r>
+      <w:r>
+        <w:rPr>
+          <w:rFonts w:eastAsia="Arial" w:cs="Arial"/>
+          <w:sz w:val="20"/>
+          <w:szCs w:val="20"/>
+        </w:rPr>
+        <w:t>testing standards and optimized the existing frameworks, increasing code coverage by up to 20%</w:t>
       </w:r>
     </w:p>
     <w:p>
@@ -657,7 +851,7 @@
           <w:ilvl w:val="0"/>
           <w:numId w:val="4"/>
         </w:numPr>
-        <w:spacing w:after="120"/>
+        <w:spacing w:after="120" w:afterAutospacing="off"/>
         <w:ind w:left="360"/>
         <w:rPr>
           <w:rFonts w:eastAsia="Arial" w:cs="Arial"/>
@@ -681,7 +875,7 @@
           <w:ilvl w:val="0"/>
           <w:numId w:val="4"/>
         </w:numPr>
-        <w:spacing w:after="120"/>
+        <w:spacing w:after="120" w:afterAutospacing="off"/>
         <w:ind w:left="360"/>
         <w:rPr>
           <w:rFonts w:eastAsia="Arial" w:cs="Arial"/>
@@ -703,12 +897,12 @@
         <w:tblStyle w:val="TableGrid"/>
         <w:tblW w:w="0" w:type="auto"/>
         <w:tblBorders>
-          <w:top w:val="none" w:sz="12" w:space="0" w:color="000000" w:themeColor="text1"/>
-          <w:left w:val="none" w:sz="12" w:space="0" w:color="000000" w:themeColor="text1"/>
-          <w:bottom w:val="none" w:sz="12" w:space="0" w:color="000000" w:themeColor="text1"/>
-          <w:right w:val="none" w:sz="12" w:space="0" w:color="000000" w:themeColor="text1"/>
-          <w:insideH w:val="none" w:sz="12" w:space="0" w:color="000000" w:themeColor="text1"/>
-          <w:insideV w:val="none" w:sz="12" w:space="0" w:color="000000" w:themeColor="text1"/>
+          <w:top w:val="none" w:color="000000" w:themeColor="text1" w:sz="12" w:space="0"/>
+          <w:left w:val="none" w:color="000000" w:themeColor="text1" w:sz="12" w:space="0"/>
+          <w:bottom w:val="none" w:color="000000" w:themeColor="text1" w:sz="12" w:space="0"/>
+          <w:right w:val="none" w:color="000000" w:themeColor="text1" w:sz="12" w:space="0"/>
+          <w:insideH w:val="none" w:color="000000" w:themeColor="text1" w:sz="12" w:space="0"/>
+          <w:insideV w:val="none" w:color="000000" w:themeColor="text1" w:sz="12" w:space="0"/>
         </w:tblBorders>
         <w:tblLook w:val="06A0" w:firstRow="1" w:lastRow="0" w:firstColumn="1" w:lastColumn="0" w:noHBand="1" w:noVBand="1"/>
       </w:tblPr>
@@ -723,33 +917,116 @@
         <w:tc>
           <w:tcPr>
             <w:tcW w:w="4680" w:type="dxa"/>
+            <w:tcMar/>
           </w:tcPr>
           <w:p>
             <w:pPr>
-              <w:spacing w:line="279" w:lineRule="auto"/>
-              <w:rPr>
-                <w:rFonts w:eastAsia="Arial" w:cs="Arial"/>
-                <w:b/>
-                <w:bCs/>
-                <w:sz w:val="18"/>
-                <w:szCs w:val="18"/>
+              <w:pStyle w:val="Normal"/>
+              <w:suppressLineNumbers w:val="0"/>
+              <w:bidi w:val="0"/>
+              <w:spacing w:before="0" w:beforeAutospacing="off" w:after="0" w:afterAutospacing="off" w:line="279" w:lineRule="auto"/>
+              <w:ind w:left="0" w:right="0"/>
+              <w:jc w:val="left"/>
+              <w:rPr>
+                <w:rFonts w:eastAsia="Arial" w:cs="Arial"/>
+                <w:i w:val="1"/>
+                <w:iCs w:val="1"/>
+                <w:sz w:val="20"/>
+                <w:szCs w:val="20"/>
               </w:rPr>
             </w:pPr>
             <w:r>
               <w:rPr>
                 <w:rFonts w:eastAsia="Arial" w:cs="Arial"/>
-                <w:b/>
-                <w:bCs/>
-                <w:sz w:val="20"/>
-                <w:szCs w:val="20"/>
-              </w:rPr>
-              <w:t>University of Nevada, Reno</w:t>
+                <w:b w:val="1"/>
+                <w:bCs w:val="1"/>
+                <w:sz w:val="20"/>
+                <w:szCs w:val="20"/>
+              </w:rPr>
+              <w:t>Cancer</w:t>
             </w:r>
+            <w:r>
+              <w:rPr>
+                <w:rFonts w:eastAsia="Arial" w:cs="Arial"/>
+                <w:b w:val="1"/>
+                <w:bCs w:val="1"/>
+                <w:sz w:val="20"/>
+                <w:szCs w:val="20"/>
+              </w:rPr>
+              <w:t>’</w:t>
+            </w:r>
+            <w:r>
+              <w:rPr>
+                <w:rFonts w:eastAsia="Arial" w:cs="Arial"/>
+                <w:b w:val="1"/>
+                <w:bCs w:val="1"/>
+                <w:sz w:val="20"/>
+                <w:szCs w:val="20"/>
+              </w:rPr>
+              <w:t>s Compass</w:t>
+            </w:r>
+            <w:r>
+              <w:rPr>
+                <w:rFonts w:eastAsia="Arial" w:cs="Arial"/>
+                <w:b w:val="1"/>
+                <w:bCs w:val="1"/>
+                <w:sz w:val="20"/>
+                <w:szCs w:val="20"/>
+              </w:rPr>
+              <w:t xml:space="preserve"> | </w:t>
+            </w:r>
+            <w:hyperlink r:id="Rd44fc7f28e2645c8">
+              <w:r>
+                <w:rPr>
+                  <w:rStyle w:val="Hyperlink"/>
+                  <w:rFonts w:eastAsia="Arial" w:cs="Arial"/>
+                  <w:i w:val="1"/>
+                  <w:iCs w:val="1"/>
+                  <w:sz w:val="20"/>
+                  <w:szCs w:val="20"/>
+                </w:rPr>
+                <w:t>App Store</w:t>
+              </w:r>
+            </w:hyperlink>
+            <w:r>
+              <w:rPr>
+                <w:rFonts w:eastAsia="Arial" w:cs="Arial"/>
+                <w:i w:val="1"/>
+                <w:iCs w:val="1"/>
+                <w:sz w:val="20"/>
+                <w:szCs w:val="20"/>
+              </w:rPr>
+              <w:t xml:space="preserve"> </w:t>
+            </w:r>
+            <w:r>
+              <w:rPr>
+                <w:rFonts w:eastAsia="Arial" w:cs="Arial"/>
+                <w:i w:val="1"/>
+                <w:iCs w:val="1"/>
+                <w:sz w:val="20"/>
+                <w:szCs w:val="20"/>
+              </w:rPr>
+              <w:t xml:space="preserve">• </w:t>
+            </w:r>
+            <w:hyperlink r:id="Rae5b9364fa6744c1">
+              <w:r>
+                <w:rPr>
+                  <w:rStyle w:val="Hyperlink"/>
+                  <w:rFonts w:eastAsia="Arial" w:cs="Arial"/>
+                  <w:i w:val="1"/>
+                  <w:iCs w:val="1"/>
+                  <w:sz w:val="20"/>
+                  <w:szCs w:val="20"/>
+                </w:rPr>
+                <w:t>Google Play</w:t>
+              </w:r>
+            </w:hyperlink>
           </w:p>
         </w:tc>
         <w:tc>
           <w:tcPr>
             <w:tcW w:w="6237" w:type="dxa"/>
+            <w:tcMar/>
             <w:vAlign w:val="center"/>
           </w:tcPr>
           <w:p>
@@ -783,32 +1060,33 @@
         <w:tc>
           <w:tcPr>
             <w:tcW w:w="4680" w:type="dxa"/>
+            <w:tcMar/>
           </w:tcPr>
           <w:p>
             <w:pPr>
-              <w:rPr>
-                <w:rFonts w:eastAsia="Arial" w:cs="Arial"/>
-                <w:i/>
-                <w:iCs/>
-                <w:sz w:val="18"/>
-                <w:szCs w:val="18"/>
-              </w:rPr>
+              <w:pStyle w:val="Normal"/>
+              <w:suppressLineNumbers w:val="0"/>
+              <w:bidi w:val="0"/>
+              <w:spacing w:before="0" w:beforeAutospacing="off" w:after="0" w:afterAutospacing="off" w:line="240" w:lineRule="auto"/>
+              <w:ind w:left="0" w:right="0"/>
+              <w:jc w:val="left"/>
             </w:pPr>
             <w:r>
               <w:rPr>
                 <w:rFonts w:eastAsia="Arial" w:cs="Arial"/>
-                <w:i/>
-                <w:iCs/>
-                <w:sz w:val="20"/>
-                <w:szCs w:val="20"/>
-              </w:rPr>
-              <w:t>Engineering Tutor</w:t>
+                <w:i w:val="1"/>
+                <w:iCs w:val="1"/>
+                <w:sz w:val="20"/>
+                <w:szCs w:val="20"/>
+              </w:rPr>
+              <w:t>iOS &amp; Android Developer</w:t>
             </w:r>
           </w:p>
         </w:tc>
         <w:tc>
           <w:tcPr>
             <w:tcW w:w="6237" w:type="dxa"/>
+            <w:tcMar/>
             <w:vAlign w:val="center"/>
           </w:tcPr>
           <w:p>
@@ -816,8 +1094,8 @@
               <w:jc w:val="right"/>
               <w:rPr>
                 <w:rFonts w:eastAsia="Arial" w:cs="Arial"/>
-                <w:i/>
-                <w:iCs/>
+                <w:i w:val="1"/>
+                <w:iCs w:val="1"/>
                 <w:sz w:val="18"/>
                 <w:szCs w:val="18"/>
               </w:rPr>
@@ -825,12 +1103,52 @@
             <w:r>
               <w:rPr>
                 <w:rFonts w:eastAsia="Arial" w:cs="Arial"/>
-                <w:i/>
-                <w:iCs/>
-                <w:sz w:val="20"/>
-                <w:szCs w:val="20"/>
-              </w:rPr>
-              <w:t>Sept 2019 – Jan 2022</w:t>
+                <w:i w:val="1"/>
+                <w:iCs w:val="1"/>
+                <w:sz w:val="20"/>
+                <w:szCs w:val="20"/>
+              </w:rPr>
+              <w:t xml:space="preserve">March </w:t>
+            </w:r>
+            <w:r>
+              <w:rPr>
+                <w:rFonts w:eastAsia="Arial" w:cs="Arial"/>
+                <w:i w:val="1"/>
+                <w:iCs w:val="1"/>
+                <w:sz w:val="20"/>
+                <w:szCs w:val="20"/>
+              </w:rPr>
+              <w:t>20</w:t>
+            </w:r>
+            <w:r>
+              <w:rPr>
+                <w:rFonts w:eastAsia="Arial" w:cs="Arial"/>
+                <w:i w:val="1"/>
+                <w:iCs w:val="1"/>
+                <w:sz w:val="20"/>
+                <w:szCs w:val="20"/>
+              </w:rPr>
+              <w:t xml:space="preserve">25 </w:t>
+            </w:r>
+            <w:r>
+              <w:rPr>
+                <w:rFonts w:eastAsia="Arial" w:cs="Arial"/>
+                <w:i w:val="1"/>
+                <w:iCs w:val="1"/>
+                <w:sz w:val="20"/>
+                <w:szCs w:val="20"/>
+              </w:rPr>
+              <w:t xml:space="preserve">– </w:t>
+            </w:r>
+            <w:r>
+              <w:rPr>
+                <w:rFonts w:eastAsia="Arial" w:cs="Arial"/>
+                <w:i w:val="1"/>
+                <w:iCs w:val="1"/>
+                <w:sz w:val="20"/>
+                <w:szCs w:val="20"/>
+              </w:rPr>
+              <w:t>Current</w:t>
             </w:r>
           </w:p>
         </w:tc>
@@ -843,20 +1161,32 @@
           <w:ilvl w:val="0"/>
           <w:numId w:val="1"/>
         </w:numPr>
-        <w:ind w:left="360"/>
-        <w:rPr>
-          <w:rFonts w:eastAsia="Arial" w:cs="Arial"/>
-          <w:sz w:val="20"/>
-          <w:szCs w:val="20"/>
-        </w:rPr>
-      </w:pPr>
-      <w:r>
-        <w:rPr>
-          <w:rFonts w:eastAsia="Arial" w:cs="Arial"/>
-          <w:sz w:val="20"/>
-          <w:szCs w:val="20"/>
-        </w:rPr>
-        <w:t>Tutored students in core Computer Science courses, including Intro CS, Data Structures, Databases, and Algorithms</w:t>
+        <w:suppressLineNumbers w:val="0"/>
+        <w:bidi w:val="0"/>
+        <w:spacing w:before="0" w:beforeAutospacing="off" w:after="120" w:afterAutospacing="off" w:line="279" w:lineRule="auto"/>
+        <w:ind w:left="360" w:right="0" w:hanging="360"/>
+        <w:jc w:val="left"/>
+        <w:rPr>
+          <w:rFonts w:eastAsia="Arial" w:cs="Arial"/>
+          <w:sz w:val="20"/>
+          <w:szCs w:val="20"/>
+        </w:rPr>
+      </w:pPr>
+      <w:r>
+        <w:rPr>
+          <w:rFonts w:eastAsia="Arial" w:cs="Arial"/>
+          <w:sz w:val="20"/>
+          <w:szCs w:val="20"/>
+        </w:rPr>
+        <w:t>Independently architected and developed the entire app using Flutter, Fireba</w:t>
+      </w:r>
+      <w:r>
+        <w:rPr>
+          <w:rFonts w:eastAsia="Arial" w:cs="Arial"/>
+          <w:sz w:val="20"/>
+          <w:szCs w:val="20"/>
+        </w:rPr>
+        <w:t>se, and Google Cloud Functions</w:t>
       </w:r>
     </w:p>
     <w:p>
@@ -866,26 +1196,86 @@
           <w:ilvl w:val="0"/>
           <w:numId w:val="1"/>
         </w:numPr>
-        <w:ind w:left="360"/>
-        <w:rPr>
-          <w:rFonts w:eastAsia="Arial" w:cs="Arial"/>
-          <w:sz w:val="20"/>
-          <w:szCs w:val="20"/>
-        </w:rPr>
-      </w:pPr>
-      <w:r>
-        <w:rPr>
-          <w:rFonts w:eastAsia="Arial" w:cs="Arial"/>
-          <w:sz w:val="20"/>
-          <w:szCs w:val="20"/>
-        </w:rPr>
-        <w:t xml:space="preserve">Provided students with practice problems, study guides, and examples to enhance understanding of key CS Topics </w:t>
+        <w:suppressLineNumbers w:val="0"/>
+        <w:bidi w:val="0"/>
+        <w:spacing w:before="0" w:beforeAutospacing="off" w:after="120" w:afterAutospacing="off" w:line="279" w:lineRule="auto"/>
+        <w:ind w:left="360" w:right="0" w:hanging="360"/>
+        <w:jc w:val="left"/>
+        <w:rPr>
+          <w:rFonts w:eastAsia="Arial" w:cs="Arial"/>
+          <w:sz w:val="20"/>
+          <w:szCs w:val="20"/>
+        </w:rPr>
+      </w:pPr>
+      <w:r>
+        <w:rPr>
+          <w:rFonts w:eastAsia="Arial" w:cs="Arial"/>
+          <w:sz w:val="20"/>
+          <w:szCs w:val="20"/>
+        </w:rPr>
+        <w:t>Designed a multi-source search aggregator, delivering custom localized medical resources for cancer patients</w:t>
       </w:r>
     </w:p>
     <w:p>
       <w:pPr>
+        <w:pStyle w:val="ListParagraph"/>
+        <w:numPr>
+          <w:ilvl w:val="0"/>
+          <w:numId w:val="1"/>
+        </w:numPr>
+        <w:spacing w:after="120" w:afterAutospacing="off"/>
+        <w:ind w:left="360"/>
+        <w:rPr>
+          <w:rFonts w:eastAsia="Arial" w:cs="Arial"/>
+          <w:sz w:val="20"/>
+          <w:szCs w:val="20"/>
+        </w:rPr>
+      </w:pPr>
+      <w:r>
+        <w:rPr>
+          <w:rFonts w:eastAsia="Arial" w:cs="Arial"/>
+          <w:sz w:val="20"/>
+          <w:szCs w:val="20"/>
+        </w:rPr>
+        <w:t>Built a forum allowing threaded discussions and public posts, enabling scalable user communication and peer support</w:t>
+      </w:r>
+    </w:p>
+    <w:p>
+      <w:pPr>
+        <w:pStyle w:val="ListParagraph"/>
+        <w:numPr>
+          <w:ilvl w:val="0"/>
+          <w:numId w:val="1"/>
+        </w:numPr>
+        <w:spacing w:after="120" w:afterAutospacing="off"/>
+        <w:ind w:left="360"/>
+        <w:rPr>
+          <w:rFonts w:eastAsia="Arial" w:cs="Arial"/>
+          <w:sz w:val="20"/>
+          <w:szCs w:val="20"/>
+        </w:rPr>
+      </w:pPr>
+      <w:r>
+        <w:rPr>
+          <w:rFonts w:eastAsia="Arial" w:cs="Arial"/>
+          <w:sz w:val="20"/>
+          <w:szCs w:val="20"/>
+        </w:rPr>
+        <w:t>Developed an admin dashboard supporting real-time app customization, resource curation, and user moderation</w:t>
+      </w:r>
+      <w:r>
+        <w:rPr>
+          <w:rFonts w:eastAsia="Arial" w:cs="Arial"/>
+          <w:sz w:val="20"/>
+          <w:szCs w:val="20"/>
+        </w:rPr>
+        <w:t xml:space="preserve"> </w:t>
+      </w:r>
+    </w:p>
+    <w:p>
+      <w:pPr>
         <w:pBdr>
-          <w:bottom w:val="single" w:sz="12" w:space="1" w:color="000000"/>
+          <w:bottom w:val="single" w:color="000000" w:sz="12" w:space="1"/>
         </w:pBdr>
         <w:rPr>
           <w:rFonts w:eastAsia="Times New Roman" w:cs="Times New Roman"/>
@@ -909,12 +1299,12 @@
         <w:tblStyle w:val="TableGrid"/>
         <w:tblW w:w="10917" w:type="dxa"/>
         <w:tblBorders>
-          <w:top w:val="none" w:sz="12" w:space="0" w:color="000000" w:themeColor="text1"/>
-          <w:left w:val="none" w:sz="12" w:space="0" w:color="000000" w:themeColor="text1"/>
-          <w:bottom w:val="none" w:sz="12" w:space="0" w:color="000000" w:themeColor="text1"/>
-          <w:right w:val="none" w:sz="12" w:space="0" w:color="000000" w:themeColor="text1"/>
-          <w:insideH w:val="none" w:sz="12" w:space="0" w:color="000000" w:themeColor="text1"/>
-          <w:insideV w:val="none" w:sz="12" w:space="0" w:color="000000" w:themeColor="text1"/>
+          <w:top w:val="none" w:color="000000" w:themeColor="text1" w:sz="12" w:space="0"/>
+          <w:left w:val="none" w:color="000000" w:themeColor="text1" w:sz="12" w:space="0"/>
+          <w:bottom w:val="none" w:color="000000" w:themeColor="text1" w:sz="12" w:space="0"/>
+          <w:right w:val="none" w:color="000000" w:themeColor="text1" w:sz="12" w:space="0"/>
+          <w:insideH w:val="none" w:color="000000" w:themeColor="text1" w:sz="12" w:space="0"/>
+          <w:insideV w:val="none" w:color="000000" w:themeColor="text1" w:sz="12" w:space="0"/>
         </w:tblBorders>
         <w:tblLayout w:type="fixed"/>
         <w:tblLook w:val="06A0" w:firstRow="1" w:lastRow="0" w:firstColumn="1" w:lastColumn="0" w:noHBand="1" w:noVBand="1"/>
@@ -930,6 +1320,7 @@
         <w:tc>
           <w:tcPr>
             <w:tcW w:w="4680" w:type="dxa"/>
+            <w:tcMar/>
           </w:tcPr>
           <w:p>
             <w:pPr>
@@ -991,6 +1382,7 @@
         <w:tc>
           <w:tcPr>
             <w:tcW w:w="6237" w:type="dxa"/>
+            <w:tcMar/>
             <w:vAlign w:val="center"/>
           </w:tcPr>
           <w:p>
@@ -1024,14 +1416,15 @@
         <w:tc>
           <w:tcPr>
             <w:tcW w:w="4680" w:type="dxa"/>
+            <w:tcMar/>
           </w:tcPr>
           <w:p>
             <w:pPr>
               <w:spacing w:line="279" w:lineRule="auto"/>
               <w:rPr>
                 <w:rFonts w:eastAsia="Arial" w:cs="Arial"/>
-                <w:i/>
-                <w:iCs/>
+                <w:i w:val="1"/>
+                <w:iCs w:val="1"/>
                 <w:sz w:val="18"/>
                 <w:szCs w:val="18"/>
               </w:rPr>
@@ -1039,18 +1432,19 @@
             <w:r>
               <w:rPr>
                 <w:rFonts w:eastAsia="Arial" w:cs="Arial"/>
-                <w:i/>
-                <w:iCs/>
-                <w:sz w:val="20"/>
-                <w:szCs w:val="20"/>
-              </w:rPr>
-              <w:t>Lead Full-Stack Developer</w:t>
+                <w:i w:val="1"/>
+                <w:iCs w:val="1"/>
+                <w:sz w:val="20"/>
+                <w:szCs w:val="20"/>
+              </w:rPr>
+              <w:t>Full-Stack Developer</w:t>
             </w:r>
           </w:p>
         </w:tc>
         <w:tc>
           <w:tcPr>
             <w:tcW w:w="6237" w:type="dxa"/>
+            <w:tcMar/>
             <w:vAlign w:val="center"/>
           </w:tcPr>
           <w:p>
@@ -1078,13 +1472,14 @@
         </w:tc>
       </w:tr>
     </w:tbl>
-    <w:p>
+    <w:p w14:noSpellErr="1">
       <w:pPr>
         <w:pStyle w:val="ListParagraph"/>
         <w:numPr>
           <w:ilvl w:val="0"/>
           <w:numId w:val="3"/>
         </w:numPr>
+        <w:spacing w:after="120" w:afterAutospacing="off"/>
         <w:ind w:left="360"/>
         <w:rPr>
           <w:rFonts w:eastAsia="Arial" w:cs="Arial"/>
@@ -1124,6 +1519,7 @@
           <w:ilvl w:val="0"/>
           <w:numId w:val="3"/>
         </w:numPr>
+        <w:spacing w:after="120" w:afterAutospacing="off"/>
         <w:ind w:left="360"/>
         <w:rPr>
           <w:rFonts w:eastAsia="Arial" w:cs="Arial"/>
@@ -1147,6 +1543,7 @@
           <w:ilvl w:val="0"/>
           <w:numId w:val="3"/>
         </w:numPr>
+        <w:spacing w:after="120" w:afterAutospacing="off"/>
         <w:ind w:left="360"/>
         <w:rPr>
           <w:rFonts w:eastAsia="Arial" w:cs="Arial"/>
@@ -1160,7 +1557,39 @@
           <w:sz w:val="20"/>
           <w:szCs w:val="20"/>
         </w:rPr>
-        <w:t>Designed and implemented the full stack using HTML, CSS, JavaScript, and using Shell for automated deployment</w:t>
+        <w:t xml:space="preserve">Designed and implemented the full stack using HTML, CSS, </w:t>
+      </w:r>
+      <w:r>
+        <w:rPr>
+          <w:rFonts w:eastAsia="Arial" w:cs="Arial"/>
+          <w:sz w:val="20"/>
+          <w:szCs w:val="20"/>
+        </w:rPr>
+        <w:t xml:space="preserve">and </w:t>
+      </w:r>
+      <w:r>
+        <w:rPr>
+          <w:rFonts w:eastAsia="Arial" w:cs="Arial"/>
+          <w:sz w:val="20"/>
+          <w:szCs w:val="20"/>
+        </w:rPr>
+        <w:t xml:space="preserve">JavaScript </w:t>
+      </w:r>
+      <w:r>
+        <w:rPr>
+          <w:rFonts w:eastAsia="Arial" w:cs="Arial"/>
+          <w:sz w:val="20"/>
+          <w:szCs w:val="20"/>
+        </w:rPr>
+        <w:t xml:space="preserve">while </w:t>
+      </w:r>
+      <w:r>
+        <w:rPr>
+          <w:rFonts w:eastAsia="Arial" w:cs="Arial"/>
+          <w:sz w:val="20"/>
+          <w:szCs w:val="20"/>
+        </w:rPr>
+        <w:t>using Shell for automated deployment</w:t>
       </w:r>
     </w:p>
     <w:tbl>
@@ -1168,12 +1597,12 @@
         <w:tblStyle w:val="TableGrid"/>
         <w:tblW w:w="10917" w:type="dxa"/>
         <w:tblBorders>
-          <w:top w:val="none" w:sz="12" w:space="0" w:color="000000" w:themeColor="text1"/>
-          <w:left w:val="none" w:sz="12" w:space="0" w:color="000000" w:themeColor="text1"/>
-          <w:bottom w:val="none" w:sz="12" w:space="0" w:color="000000" w:themeColor="text1"/>
-          <w:right w:val="none" w:sz="12" w:space="0" w:color="000000" w:themeColor="text1"/>
-          <w:insideH w:val="none" w:sz="12" w:space="0" w:color="000000" w:themeColor="text1"/>
-          <w:insideV w:val="none" w:sz="12" w:space="0" w:color="000000" w:themeColor="text1"/>
+          <w:top w:val="none" w:color="000000" w:themeColor="text1" w:sz="12" w:space="0"/>
+          <w:left w:val="none" w:color="000000" w:themeColor="text1" w:sz="12" w:space="0"/>
+          <w:bottom w:val="none" w:color="000000" w:themeColor="text1" w:sz="12" w:space="0"/>
+          <w:right w:val="none" w:color="000000" w:themeColor="text1" w:sz="12" w:space="0"/>
+          <w:insideH w:val="none" w:color="000000" w:themeColor="text1" w:sz="12" w:space="0"/>
+          <w:insideV w:val="none" w:color="000000" w:themeColor="text1" w:sz="12" w:space="0"/>
         </w:tblBorders>
         <w:tblLayout w:type="fixed"/>
         <w:tblLook w:val="06A0" w:firstRow="1" w:lastRow="0" w:firstColumn="1" w:lastColumn="0" w:noHBand="1" w:noVBand="1"/>
@@ -1321,6 +1750,7 @@
           <w:ilvl w:val="0"/>
           <w:numId w:val="2"/>
         </w:numPr>
+        <w:spacing w:after="120" w:afterAutospacing="off"/>
         <w:ind w:left="360"/>
         <w:rPr>
           <w:rFonts w:eastAsia="Arial" w:cs="Arial"/>
@@ -1334,7 +1764,23 @@
           <w:sz w:val="20"/>
           <w:szCs w:val="20"/>
         </w:rPr>
-        <w:t>Implemented Levenshtein distance algorithm, providing a metric to track measurable improvements in speech quality</w:t>
+        <w:t xml:space="preserve">Implemented </w:t>
+      </w:r>
+      <w:r>
+        <w:rPr>
+          <w:rFonts w:eastAsia="Arial" w:cs="Arial"/>
+          <w:sz w:val="20"/>
+          <w:szCs w:val="20"/>
+        </w:rPr>
+        <w:t>Levenshtein</w:t>
+      </w:r>
+      <w:r>
+        <w:rPr>
+          <w:rFonts w:eastAsia="Arial" w:cs="Arial"/>
+          <w:sz w:val="20"/>
+          <w:szCs w:val="20"/>
+        </w:rPr>
+        <w:t xml:space="preserve"> distance algorithm, providing a metric to track measurable improvements in speech quality</w:t>
       </w:r>
     </w:p>
     <w:p>
@@ -1344,6 +1790,7 @@
           <w:ilvl w:val="0"/>
           <w:numId w:val="2"/>
         </w:numPr>
+        <w:spacing w:after="120" w:afterAutospacing="off"/>
         <w:ind w:left="360"/>
         <w:rPr>
           <w:rFonts w:eastAsia="Arial" w:cs="Arial"/>
@@ -1357,84 +1804,13 @@
           <w:sz w:val="20"/>
           <w:szCs w:val="20"/>
         </w:rPr>
-        <w:t xml:space="preserve">Designed the back end and GUI for a dynamic settings page, using </w:t>
-      </w:r>
-      <w:r>
-        <w:rPr>
-          <w:rFonts w:eastAsia="Arial" w:cs="Arial"/>
-          <w:sz w:val="20"/>
-          <w:szCs w:val="20"/>
-        </w:rPr>
-        <w:t>Bootstrap/</w:t>
-      </w:r>
-      <w:r>
-        <w:rPr>
-          <w:rFonts w:eastAsia="Arial" w:cs="Arial"/>
-          <w:sz w:val="20"/>
-          <w:szCs w:val="20"/>
-        </w:rPr>
-        <w:t>.NET framework to manage account settings</w:t>
+        <w:t>Designed the back end and GUI for a dynamic settings page, using .NET framework to manage account settings</w:t>
       </w:r>
     </w:p>
     <w:p>
       <w:pPr>
-        <w:pStyle w:val="ListParagraph"/>
-        <w:numPr>
-          <w:ilvl w:val="0"/>
-          <w:numId w:val="2"/>
-        </w:numPr>
-        <w:ind w:left="360"/>
-        <w:rPr>
-          <w:rFonts w:eastAsia="Arial" w:cs="Arial"/>
-          <w:sz w:val="20"/>
-          <w:szCs w:val="20"/>
-        </w:rPr>
-      </w:pPr>
-      <w:r>
-        <w:rPr>
-          <w:rFonts w:eastAsia="Arial" w:cs="Arial"/>
-          <w:sz w:val="20"/>
-          <w:szCs w:val="20"/>
-        </w:rPr>
-        <w:t xml:space="preserve">Created the layer connecting the front-end </w:t>
-      </w:r>
-      <w:r>
-        <w:rPr>
-          <w:rFonts w:eastAsia="Arial" w:cs="Arial"/>
-          <w:sz w:val="20"/>
-          <w:szCs w:val="20"/>
-        </w:rPr>
-        <w:t xml:space="preserve">GUI </w:t>
-      </w:r>
-      <w:r>
-        <w:rPr>
-          <w:rFonts w:eastAsia="Arial" w:cs="Arial"/>
-          <w:sz w:val="20"/>
-          <w:szCs w:val="20"/>
-        </w:rPr>
-        <w:t xml:space="preserve">to the back-end database, ensuring intuitive interaction </w:t>
-      </w:r>
-      <w:r>
-        <w:rPr>
-          <w:rFonts w:eastAsia="Arial" w:cs="Arial"/>
-          <w:sz w:val="20"/>
-          <w:szCs w:val="20"/>
-        </w:rPr>
-        <w:t xml:space="preserve">in </w:t>
-      </w:r>
-      <w:r>
-        <w:rPr>
-          <w:rFonts w:eastAsia="Arial" w:cs="Arial"/>
-          <w:sz w:val="20"/>
-          <w:szCs w:val="20"/>
-        </w:rPr>
-        <w:t>the application</w:t>
-      </w:r>
-    </w:p>
-    <w:p>
-      <w:pPr>
         <w:pBdr>
-          <w:bottom w:val="single" w:sz="12" w:space="1" w:color="000000"/>
+          <w:bottom w:val="single" w:color="000000" w:sz="12" w:space="1"/>
         </w:pBdr>
         <w:rPr>
           <w:rFonts w:eastAsia="Times New Roman" w:cs="Times New Roman"/>
@@ -1458,12 +1834,12 @@
         <w:tblStyle w:val="TableGrid"/>
         <w:tblW w:w="10917" w:type="dxa"/>
         <w:tblBorders>
-          <w:top w:val="none" w:sz="12" w:space="0" w:color="000000" w:themeColor="text1"/>
-          <w:left w:val="none" w:sz="12" w:space="0" w:color="000000" w:themeColor="text1"/>
-          <w:bottom w:val="none" w:sz="12" w:space="0" w:color="000000" w:themeColor="text1"/>
-          <w:right w:val="none" w:sz="12" w:space="0" w:color="000000" w:themeColor="text1"/>
-          <w:insideH w:val="none" w:sz="12" w:space="0" w:color="000000" w:themeColor="text1"/>
-          <w:insideV w:val="none" w:sz="12" w:space="0" w:color="000000" w:themeColor="text1"/>
+          <w:top w:val="none" w:color="000000" w:themeColor="text1" w:sz="12" w:space="0"/>
+          <w:left w:val="none" w:color="000000" w:themeColor="text1" w:sz="12" w:space="0"/>
+          <w:bottom w:val="none" w:color="000000" w:themeColor="text1" w:sz="12" w:space="0"/>
+          <w:right w:val="none" w:color="000000" w:themeColor="text1" w:sz="12" w:space="0"/>
+          <w:insideH w:val="none" w:color="000000" w:themeColor="text1" w:sz="12" w:space="0"/>
+          <w:insideV w:val="none" w:color="000000" w:themeColor="text1" w:sz="12" w:space="0"/>
         </w:tblBorders>
         <w:tblLayout w:type="fixed"/>
         <w:tblLook w:val="06A0" w:firstRow="1" w:lastRow="0" w:firstColumn="1" w:lastColumn="0" w:noHBand="1" w:noVBand="1"/>
@@ -1596,7 +1972,7 @@
     <w:p>
       <w:pPr>
         <w:pBdr>
-          <w:bottom w:val="single" w:sz="12" w:space="1" w:color="000000"/>
+          <w:bottom w:val="single" w:color="000000" w:sz="12" w:space="1"/>
         </w:pBdr>
         <w:rPr>
           <w:rFonts w:eastAsia="Arial" w:cs="Arial"/>
@@ -1607,8 +1983,8 @@
       <w:r>
         <w:rPr>
           <w:rFonts w:eastAsia="Arial" w:cs="Arial"/>
-          <w:b/>
-          <w:bCs/>
+          <w:b w:val="1"/>
+          <w:bCs w:val="1"/>
           <w:sz w:val="20"/>
           <w:szCs w:val="20"/>
         </w:rPr>
@@ -1620,13 +1996,29 @@
           <w:sz w:val="20"/>
           <w:szCs w:val="20"/>
         </w:rPr>
-        <w:t>Linux System Administration, Database Management Systems, Automata and Formal Lang, Algorithms</w:t>
+        <w:t>Linux System Administration, Database Management Systems, A</w:t>
+      </w:r>
+      <w:r>
+        <w:rPr>
+          <w:rFonts w:eastAsia="Arial" w:cs="Arial"/>
+          <w:sz w:val="20"/>
+          <w:szCs w:val="20"/>
+        </w:rPr>
+        <w:t>rtificial Intelligence</w:t>
+      </w:r>
+      <w:r>
+        <w:rPr>
+          <w:rFonts w:eastAsia="Arial" w:cs="Arial"/>
+          <w:sz w:val="20"/>
+          <w:szCs w:val="20"/>
+        </w:rPr>
+        <w:t>, Algorithms</w:t>
       </w:r>
     </w:p>
     <w:p>
       <w:pPr>
         <w:pBdr>
-          <w:bottom w:val="single" w:sz="12" w:space="1" w:color="000000"/>
+          <w:bottom w:val="single" w:color="000000" w:sz="12" w:space="1"/>
         </w:pBdr>
         <w:rPr>
           <w:rFonts w:eastAsia="Times New Roman" w:cs="Times New Roman"/>
@@ -1649,17 +2041,18 @@
     </w:p>
     <w:p>
       <w:pPr>
-        <w:rPr>
-          <w:rFonts w:eastAsia="Arial" w:cs="Arial"/>
-          <w:sz w:val="20"/>
-          <w:szCs w:val="20"/>
-        </w:rPr>
-      </w:pPr>
-      <w:r>
-        <w:rPr>
-          <w:rFonts w:eastAsia="Arial" w:cs="Arial"/>
-          <w:b/>
-          <w:bCs/>
+        <w:spacing w:after="0" w:afterAutospacing="off"/>
+        <w:rPr>
+          <w:rFonts w:eastAsia="Arial" w:cs="Arial"/>
+          <w:sz w:val="20"/>
+          <w:szCs w:val="20"/>
+        </w:rPr>
+      </w:pPr>
+      <w:r>
+        <w:rPr>
+          <w:rFonts w:eastAsia="Arial" w:cs="Arial"/>
+          <w:b w:val="1"/>
+          <w:bCs w:val="1"/>
           <w:sz w:val="20"/>
           <w:szCs w:val="20"/>
         </w:rPr>
@@ -1668,10 +2061,10 @@
       <w:r>
         <w:rPr>
           <w:rFonts w:eastAsia="Arial" w:cs="Arial"/>
-          <w:b/>
-          <w:bCs/>
-          <w:i/>
-          <w:iCs/>
+          <w:b w:val="1"/>
+          <w:bCs w:val="1"/>
+          <w:i w:val="1"/>
+          <w:iCs w:val="1"/>
           <w:sz w:val="20"/>
           <w:szCs w:val="20"/>
         </w:rPr>
@@ -1680,8 +2073,8 @@
       <w:r>
         <w:rPr>
           <w:rFonts w:eastAsia="Arial" w:cs="Arial"/>
-          <w:b/>
-          <w:bCs/>
+          <w:b w:val="1"/>
+          <w:bCs w:val="1"/>
           <w:sz w:val="20"/>
           <w:szCs w:val="20"/>
         </w:rPr>
@@ -1690,8 +2083,8 @@
       <w:r>
         <w:rPr>
           <w:rFonts w:eastAsia="Arial" w:cs="Arial"/>
-          <w:i/>
-          <w:iCs/>
+          <w:i w:val="1"/>
+          <w:iCs w:val="1"/>
           <w:sz w:val="20"/>
           <w:szCs w:val="20"/>
         </w:rPr>
@@ -1711,19 +2104,27 @@
           <w:sz w:val="20"/>
           <w:szCs w:val="20"/>
         </w:rPr>
-        <w:t>, Running</w:t>
-      </w:r>
-      <w:r>
-        <w:rPr>
-          <w:rFonts w:eastAsia="Arial" w:cs="Arial"/>
-          <w:sz w:val="20"/>
-          <w:szCs w:val="20"/>
-        </w:rPr>
-        <w:t>, Plants, Guitar, Pilates</w:t>
+        <w:t>,</w:t>
+      </w:r>
+      <w:r>
+        <w:rPr>
+          <w:rFonts w:eastAsia="Arial" w:cs="Arial"/>
+          <w:sz w:val="20"/>
+          <w:szCs w:val="20"/>
+        </w:rPr>
+        <w:t xml:space="preserve"> Skiing, Rock Climbing, Reading</w:t>
+      </w:r>
+      <w:r>
+        <w:rPr>
+          <w:rFonts w:eastAsia="Arial" w:cs="Arial"/>
+          <w:sz w:val="20"/>
+          <w:szCs w:val="20"/>
+        </w:rPr>
+        <w:t>, Biking</w:t>
       </w:r>
     </w:p>
     <w:sectPr>
-      <w:pgSz w:w="12240" w:h="15840"/>
+      <w:pgSz w:w="12240" w:h="15840" w:orient="portrait"/>
       <w:pgMar w:top="720" w:right="720" w:bottom="720" w:left="720" w:header="720" w:footer="720" w:gutter="0"/>
       <w:cols w:space="720"/>
       <w:docGrid w:linePitch="360"/>
@@ -1747,7 +2148,7 @@
         <w:ind w:left="720" w:hanging="360"/>
       </w:pPr>
       <w:rPr>
-        <w:rFonts w:ascii="Symbol" w:hAnsi="Symbol" w:hint="default"/>
+        <w:rFonts w:hint="default" w:ascii="Symbol" w:hAnsi="Symbol"/>
       </w:rPr>
     </w:lvl>
     <w:lvl w:ilvl="1" w:tplc="27264788">
@@ -1759,7 +2160,7 @@
         <w:ind w:left="1440" w:hanging="360"/>
       </w:pPr>
       <w:rPr>
-        <w:rFonts w:ascii="Courier New" w:hAnsi="Courier New" w:hint="default"/>
+        <w:rFonts w:hint="default" w:ascii="Courier New" w:hAnsi="Courier New"/>
       </w:rPr>
     </w:lvl>
     <w:lvl w:ilvl="2" w:tplc="9EC4612A">
@@ -1771,7 +2172,7 @@
         <w:ind w:left="2160" w:hanging="360"/>
       </w:pPr>
       <w:rPr>
-        <w:rFonts w:ascii="Wingdings" w:hAnsi="Wingdings" w:hint="default"/>
+        <w:rFonts w:hint="default" w:ascii="Wingdings" w:hAnsi="Wingdings"/>
       </w:rPr>
     </w:lvl>
     <w:lvl w:ilvl="3" w:tplc="1BEA6AFA">
@@ -1783,7 +2184,7 @@
         <w:ind w:left="2880" w:hanging="360"/>
       </w:pPr>
       <w:rPr>
-        <w:rFonts w:ascii="Symbol" w:hAnsi="Symbol" w:hint="default"/>
+        <w:rFonts w:hint="default" w:ascii="Symbol" w:hAnsi="Symbol"/>
       </w:rPr>
     </w:lvl>
     <w:lvl w:ilvl="4" w:tplc="87E4B896">
@@ -1795,7 +2196,7 @@
         <w:ind w:left="3600" w:hanging="360"/>
       </w:pPr>
       <w:rPr>
-        <w:rFonts w:ascii="Courier New" w:hAnsi="Courier New" w:hint="default"/>
+        <w:rFonts w:hint="default" w:ascii="Courier New" w:hAnsi="Courier New"/>
       </w:rPr>
     </w:lvl>
     <w:lvl w:ilvl="5" w:tplc="E8C458B0">
@@ -1807,7 +2208,7 @@
         <w:ind w:left="4320" w:hanging="360"/>
       </w:pPr>
       <w:rPr>
-        <w:rFonts w:ascii="Wingdings" w:hAnsi="Wingdings" w:hint="default"/>
+        <w:rFonts w:hint="default" w:ascii="Wingdings" w:hAnsi="Wingdings"/>
       </w:rPr>
     </w:lvl>
     <w:lvl w:ilvl="6" w:tplc="BAE8F2C0">
@@ -1819,7 +2220,7 @@
         <w:ind w:left="5040" w:hanging="360"/>
       </w:pPr>
       <w:rPr>
-        <w:rFonts w:ascii="Symbol" w:hAnsi="Symbol" w:hint="default"/>
+        <w:rFonts w:hint="default" w:ascii="Symbol" w:hAnsi="Symbol"/>
       </w:rPr>
     </w:lvl>
     <w:lvl w:ilvl="7" w:tplc="52B4256A">
@@ -1831,7 +2232,7 @@
         <w:ind w:left="5760" w:hanging="360"/>
       </w:pPr>
       <w:rPr>
-        <w:rFonts w:ascii="Courier New" w:hAnsi="Courier New" w:hint="default"/>
+        <w:rFonts w:hint="default" w:ascii="Courier New" w:hAnsi="Courier New"/>
       </w:rPr>
     </w:lvl>
     <w:lvl w:ilvl="8" w:tplc="B6485C90">
@@ -1843,7 +2244,7 @@
         <w:ind w:left="6480" w:hanging="360"/>
       </w:pPr>
       <w:rPr>
-        <w:rFonts w:ascii="Wingdings" w:hAnsi="Wingdings" w:hint="default"/>
+        <w:rFonts w:hint="default" w:ascii="Wingdings" w:hAnsi="Wingdings"/>
       </w:rPr>
     </w:lvl>
   </w:abstractNum>
@@ -1860,7 +2261,7 @@
         <w:ind w:left="720" w:hanging="360"/>
       </w:pPr>
       <w:rPr>
-        <w:rFonts w:ascii="Symbol" w:hAnsi="Symbol" w:hint="default"/>
+        <w:rFonts w:hint="default" w:ascii="Symbol" w:hAnsi="Symbol"/>
       </w:rPr>
     </w:lvl>
     <w:lvl w:ilvl="1" w:tplc="585AD5A0">
@@ -1872,7 +2273,7 @@
         <w:ind w:left="1440" w:hanging="360"/>
       </w:pPr>
       <w:rPr>
-        <w:rFonts w:ascii="Courier New" w:hAnsi="Courier New" w:hint="default"/>
+        <w:rFonts w:hint="default" w:ascii="Courier New" w:hAnsi="Courier New"/>
       </w:rPr>
     </w:lvl>
     <w:lvl w:ilvl="2" w:tplc="EAA2C776">
@@ -1884,7 +2285,7 @@
         <w:ind w:left="2160" w:hanging="360"/>
       </w:pPr>
       <w:rPr>
-        <w:rFonts w:ascii="Wingdings" w:hAnsi="Wingdings" w:hint="default"/>
+        <w:rFonts w:hint="default" w:ascii="Wingdings" w:hAnsi="Wingdings"/>
       </w:rPr>
     </w:lvl>
     <w:lvl w:ilvl="3" w:tplc="A820526C">
@@ -1896,7 +2297,7 @@
         <w:ind w:left="2880" w:hanging="360"/>
       </w:pPr>
       <w:rPr>
-        <w:rFonts w:ascii="Symbol" w:hAnsi="Symbol" w:hint="default"/>
+        <w:rFonts w:hint="default" w:ascii="Symbol" w:hAnsi="Symbol"/>
       </w:rPr>
     </w:lvl>
     <w:lvl w:ilvl="4" w:tplc="62B2D884">
@@ -1908,7 +2309,7 @@
         <w:ind w:left="3600" w:hanging="360"/>
       </w:pPr>
       <w:rPr>
-        <w:rFonts w:ascii="Courier New" w:hAnsi="Courier New" w:hint="default"/>
+        <w:rFonts w:hint="default" w:ascii="Courier New" w:hAnsi="Courier New"/>
       </w:rPr>
     </w:lvl>
     <w:lvl w:ilvl="5" w:tplc="CADE4F20">
@@ -1920,7 +2321,7 @@
         <w:ind w:left="4320" w:hanging="360"/>
       </w:pPr>
       <w:rPr>
-        <w:rFonts w:ascii="Wingdings" w:hAnsi="Wingdings" w:hint="default"/>
+        <w:rFonts w:hint="default" w:ascii="Wingdings" w:hAnsi="Wingdings"/>
       </w:rPr>
     </w:lvl>
     <w:lvl w:ilvl="6" w:tplc="E5709EB0">
@@ -1932,7 +2333,7 @@
         <w:ind w:left="5040" w:hanging="360"/>
       </w:pPr>
       <w:rPr>
-        <w:rFonts w:ascii="Symbol" w:hAnsi="Symbol" w:hint="default"/>
+        <w:rFonts w:hint="default" w:ascii="Symbol" w:hAnsi="Symbol"/>
       </w:rPr>
     </w:lvl>
     <w:lvl w:ilvl="7" w:tplc="2EDAA7E8">
@@ -1944,7 +2345,7 @@
         <w:ind w:left="5760" w:hanging="360"/>
       </w:pPr>
       <w:rPr>
-        <w:rFonts w:ascii="Courier New" w:hAnsi="Courier New" w:hint="default"/>
+        <w:rFonts w:hint="default" w:ascii="Courier New" w:hAnsi="Courier New"/>
       </w:rPr>
     </w:lvl>
     <w:lvl w:ilvl="8" w:tplc="FAF65FF4">
@@ -1956,7 +2357,7 @@
         <w:ind w:left="6480" w:hanging="360"/>
       </w:pPr>
       <w:rPr>
-        <w:rFonts w:ascii="Wingdings" w:hAnsi="Wingdings" w:hint="default"/>
+        <w:rFonts w:hint="default" w:ascii="Wingdings" w:hAnsi="Wingdings"/>
       </w:rPr>
     </w:lvl>
   </w:abstractNum>
@@ -1973,7 +2374,7 @@
         <w:ind w:left="720" w:hanging="360"/>
       </w:pPr>
       <w:rPr>
-        <w:rFonts w:ascii="Symbol" w:hAnsi="Symbol" w:hint="default"/>
+        <w:rFonts w:hint="default" w:ascii="Symbol" w:hAnsi="Symbol"/>
       </w:rPr>
     </w:lvl>
     <w:lvl w:ilvl="1" w:tplc="6F045250">
@@ -1985,7 +2386,7 @@
         <w:ind w:left="1440" w:hanging="360"/>
       </w:pPr>
       <w:rPr>
-        <w:rFonts w:ascii="Courier New" w:hAnsi="Courier New" w:hint="default"/>
+        <w:rFonts w:hint="default" w:ascii="Courier New" w:hAnsi="Courier New"/>
       </w:rPr>
     </w:lvl>
     <w:lvl w:ilvl="2" w:tplc="3F4A5F3C">
@@ -1997,7 +2398,7 @@
         <w:ind w:left="2160" w:hanging="360"/>
       </w:pPr>
       <w:rPr>
-        <w:rFonts w:ascii="Wingdings" w:hAnsi="Wingdings" w:hint="default"/>
+        <w:rFonts w:hint="default" w:ascii="Wingdings" w:hAnsi="Wingdings"/>
       </w:rPr>
     </w:lvl>
     <w:lvl w:ilvl="3" w:tplc="F8242C0A">
@@ -2009,7 +2410,7 @@
         <w:ind w:left="2880" w:hanging="360"/>
       </w:pPr>
       <w:rPr>
-        <w:rFonts w:ascii="Symbol" w:hAnsi="Symbol" w:hint="default"/>
+        <w:rFonts w:hint="default" w:ascii="Symbol" w:hAnsi="Symbol"/>
       </w:rPr>
     </w:lvl>
     <w:lvl w:ilvl="4" w:tplc="FD12597C">
@@ -2021,7 +2422,7 @@
         <w:ind w:left="3600" w:hanging="360"/>
       </w:pPr>
       <w:rPr>
-        <w:rFonts w:ascii="Courier New" w:hAnsi="Courier New" w:hint="default"/>
+        <w:rFonts w:hint="default" w:ascii="Courier New" w:hAnsi="Courier New"/>
       </w:rPr>
     </w:lvl>
     <w:lvl w:ilvl="5" w:tplc="82A8E364">
@@ -2033,7 +2434,7 @@
         <w:ind w:left="4320" w:hanging="360"/>
       </w:pPr>
       <w:rPr>
-        <w:rFonts w:ascii="Wingdings" w:hAnsi="Wingdings" w:hint="default"/>
+        <w:rFonts w:hint="default" w:ascii="Wingdings" w:hAnsi="Wingdings"/>
       </w:rPr>
     </w:lvl>
     <w:lvl w:ilvl="6" w:tplc="F2DEE7EC">
@@ -2045,7 +2446,7 @@
         <w:ind w:left="5040" w:hanging="360"/>
       </w:pPr>
       <w:rPr>
-        <w:rFonts w:ascii="Symbol" w:hAnsi="Symbol" w:hint="default"/>
+        <w:rFonts w:hint="default" w:ascii="Symbol" w:hAnsi="Symbol"/>
       </w:rPr>
     </w:lvl>
     <w:lvl w:ilvl="7" w:tplc="CFDE26E0">
@@ -2057,7 +2458,7 @@
         <w:ind w:left="5760" w:hanging="360"/>
       </w:pPr>
       <w:rPr>
-        <w:rFonts w:ascii="Courier New" w:hAnsi="Courier New" w:hint="default"/>
+        <w:rFonts w:hint="default" w:ascii="Courier New" w:hAnsi="Courier New"/>
       </w:rPr>
     </w:lvl>
     <w:lvl w:ilvl="8" w:tplc="C4A694D6">
@@ -2069,7 +2470,7 @@
         <w:ind w:left="6480" w:hanging="360"/>
       </w:pPr>
       <w:rPr>
-        <w:rFonts w:ascii="Wingdings" w:hAnsi="Wingdings" w:hint="default"/>
+        <w:rFonts w:hint="default" w:ascii="Wingdings" w:hAnsi="Wingdings"/>
       </w:rPr>
     </w:lvl>
   </w:abstractNum>
@@ -2086,7 +2487,7 @@
         <w:ind w:left="720" w:hanging="360"/>
       </w:pPr>
       <w:rPr>
-        <w:rFonts w:ascii="Symbol" w:hAnsi="Symbol" w:hint="default"/>
+        <w:rFonts w:hint="default" w:ascii="Symbol" w:hAnsi="Symbol"/>
       </w:rPr>
     </w:lvl>
     <w:lvl w:ilvl="1" w:tplc="F070A0BC">
@@ -2098,7 +2499,7 @@
         <w:ind w:left="1440" w:hanging="360"/>
       </w:pPr>
       <w:rPr>
-        <w:rFonts w:ascii="Courier New" w:hAnsi="Courier New" w:hint="default"/>
+        <w:rFonts w:hint="default" w:ascii="Courier New" w:hAnsi="Courier New"/>
       </w:rPr>
     </w:lvl>
     <w:lvl w:ilvl="2" w:tplc="C9E2782E">
@@ -2110,7 +2511,7 @@
         <w:ind w:left="2160" w:hanging="360"/>
       </w:pPr>
       <w:rPr>
-        <w:rFonts w:ascii="Wingdings" w:hAnsi="Wingdings" w:hint="default"/>
+        <w:rFonts w:hint="default" w:ascii="Wingdings" w:hAnsi="Wingdings"/>
       </w:rPr>
     </w:lvl>
     <w:lvl w:ilvl="3" w:tplc="E24E5FE6">
@@ -2122,7 +2523,7 @@
         <w:ind w:left="2880" w:hanging="360"/>
       </w:pPr>
       <w:rPr>
-        <w:rFonts w:ascii="Symbol" w:hAnsi="Symbol" w:hint="default"/>
+        <w:rFonts w:hint="default" w:ascii="Symbol" w:hAnsi="Symbol"/>
       </w:rPr>
     </w:lvl>
     <w:lvl w:ilvl="4" w:tplc="74ECDF5E">
@@ -2134,7 +2535,7 @@
         <w:ind w:left="3600" w:hanging="360"/>
       </w:pPr>
       <w:rPr>
-        <w:rFonts w:ascii="Courier New" w:hAnsi="Courier New" w:hint="default"/>
+        <w:rFonts w:hint="default" w:ascii="Courier New" w:hAnsi="Courier New"/>
       </w:rPr>
     </w:lvl>
     <w:lvl w:ilvl="5" w:tplc="C082F030">
@@ -2146,7 +2547,7 @@
         <w:ind w:left="4320" w:hanging="360"/>
       </w:pPr>
       <w:rPr>
-        <w:rFonts w:ascii="Wingdings" w:hAnsi="Wingdings" w:hint="default"/>
+        <w:rFonts w:hint="default" w:ascii="Wingdings" w:hAnsi="Wingdings"/>
       </w:rPr>
     </w:lvl>
     <w:lvl w:ilvl="6" w:tplc="F7D42806">
@@ -2158,7 +2559,7 @@
         <w:ind w:left="5040" w:hanging="360"/>
       </w:pPr>
       <w:rPr>
-        <w:rFonts w:ascii="Symbol" w:hAnsi="Symbol" w:hint="default"/>
+        <w:rFonts w:hint="default" w:ascii="Symbol" w:hAnsi="Symbol"/>
       </w:rPr>
     </w:lvl>
     <w:lvl w:ilvl="7" w:tplc="CD2EEE70">
@@ -2170,7 +2571,7 @@
         <w:ind w:left="5760" w:hanging="360"/>
       </w:pPr>
       <w:rPr>
-        <w:rFonts w:ascii="Courier New" w:hAnsi="Courier New" w:hint="default"/>
+        <w:rFonts w:hint="default" w:ascii="Courier New" w:hAnsi="Courier New"/>
       </w:rPr>
     </w:lvl>
     <w:lvl w:ilvl="8" w:tplc="C0A28898">
@@ -2182,7 +2583,7 @@
         <w:ind w:left="6480" w:hanging="360"/>
       </w:pPr>
       <w:rPr>
-        <w:rFonts w:ascii="Wingdings" w:hAnsi="Wingdings" w:hint="default"/>
+        <w:rFonts w:hint="default" w:ascii="Wingdings" w:hAnsi="Wingdings"/>
       </w:rPr>
     </w:lvl>
   </w:abstractNum>
@@ -2199,7 +2600,7 @@
         <w:ind w:left="720" w:hanging="360"/>
       </w:pPr>
       <w:rPr>
-        <w:rFonts w:ascii="Symbol" w:hAnsi="Symbol" w:hint="default"/>
+        <w:rFonts w:hint="default" w:ascii="Symbol" w:hAnsi="Symbol"/>
       </w:rPr>
     </w:lvl>
     <w:lvl w:ilvl="1" w:tplc="7DDAAA5E">
@@ -2211,7 +2612,7 @@
         <w:ind w:left="1440" w:hanging="360"/>
       </w:pPr>
       <w:rPr>
-        <w:rFonts w:ascii="Courier New" w:hAnsi="Courier New" w:hint="default"/>
+        <w:rFonts w:hint="default" w:ascii="Courier New" w:hAnsi="Courier New"/>
       </w:rPr>
     </w:lvl>
     <w:lvl w:ilvl="2" w:tplc="7B9CAC70">
@@ -2223,7 +2624,7 @@
         <w:ind w:left="2160" w:hanging="360"/>
       </w:pPr>
       <w:rPr>
-        <w:rFonts w:ascii="Wingdings" w:hAnsi="Wingdings" w:hint="default"/>
+        <w:rFonts w:hint="default" w:ascii="Wingdings" w:hAnsi="Wingdings"/>
       </w:rPr>
     </w:lvl>
     <w:lvl w:ilvl="3" w:tplc="D6868EA0">
@@ -2235,7 +2636,7 @@
         <w:ind w:left="2880" w:hanging="360"/>
       </w:pPr>
       <w:rPr>
-        <w:rFonts w:ascii="Symbol" w:hAnsi="Symbol" w:hint="default"/>
+        <w:rFonts w:hint="default" w:ascii="Symbol" w:hAnsi="Symbol"/>
       </w:rPr>
     </w:lvl>
     <w:lvl w:ilvl="4" w:tplc="19D8BB3C">
@@ -2247,7 +2648,7 @@
         <w:ind w:left="3600" w:hanging="360"/>
       </w:pPr>
       <w:rPr>
-        <w:rFonts w:ascii="Courier New" w:hAnsi="Courier New" w:hint="default"/>
+        <w:rFonts w:hint="default" w:ascii="Courier New" w:hAnsi="Courier New"/>
       </w:rPr>
     </w:lvl>
     <w:lvl w:ilvl="5" w:tplc="A0869F70">
@@ -2259,7 +2660,7 @@
         <w:ind w:left="4320" w:hanging="360"/>
       </w:pPr>
       <w:rPr>
-        <w:rFonts w:ascii="Wingdings" w:hAnsi="Wingdings" w:hint="default"/>
+        <w:rFonts w:hint="default" w:ascii="Wingdings" w:hAnsi="Wingdings"/>
       </w:rPr>
     </w:lvl>
     <w:lvl w:ilvl="6" w:tplc="08A4F972">
@@ -2271,7 +2672,7 @@
         <w:ind w:left="5040" w:hanging="360"/>
       </w:pPr>
       <w:rPr>
-        <w:rFonts w:ascii="Symbol" w:hAnsi="Symbol" w:hint="default"/>
+        <w:rFonts w:hint="default" w:ascii="Symbol" w:hAnsi="Symbol"/>
       </w:rPr>
     </w:lvl>
     <w:lvl w:ilvl="7" w:tplc="1C566646">
@@ -2283,7 +2684,7 @@
         <w:ind w:left="5760" w:hanging="360"/>
       </w:pPr>
       <w:rPr>
-        <w:rFonts w:ascii="Courier New" w:hAnsi="Courier New" w:hint="default"/>
+        <w:rFonts w:hint="default" w:ascii="Courier New" w:hAnsi="Courier New"/>
       </w:rPr>
     </w:lvl>
     <w:lvl w:ilvl="8" w:tplc="2160D9FA">
@@ -2295,7 +2696,7 @@
         <w:ind w:left="6480" w:hanging="360"/>
       </w:pPr>
       <w:rPr>
-        <w:rFonts w:ascii="Wingdings" w:hAnsi="Wingdings" w:hint="default"/>
+        <w:rFonts w:hint="default" w:ascii="Wingdings" w:hAnsi="Wingdings"/>
       </w:rPr>
     </w:lvl>
   </w:abstractNum>
@@ -2312,7 +2713,7 @@
         <w:ind w:left="720" w:hanging="360"/>
       </w:pPr>
       <w:rPr>
-        <w:rFonts w:ascii="Symbol" w:hAnsi="Symbol" w:hint="default"/>
+        <w:rFonts w:hint="default" w:ascii="Symbol" w:hAnsi="Symbol"/>
       </w:rPr>
     </w:lvl>
     <w:lvl w:ilvl="1" w:tplc="2ED03B64">
@@ -2324,7 +2725,7 @@
         <w:ind w:left="1440" w:hanging="360"/>
       </w:pPr>
       <w:rPr>
-        <w:rFonts w:ascii="Courier New" w:hAnsi="Courier New" w:hint="default"/>
+        <w:rFonts w:hint="default" w:ascii="Courier New" w:hAnsi="Courier New"/>
       </w:rPr>
     </w:lvl>
     <w:lvl w:ilvl="2" w:tplc="DE9E1080">
@@ -2336,7 +2737,7 @@
         <w:ind w:left="2160" w:hanging="360"/>
       </w:pPr>
       <w:rPr>
-        <w:rFonts w:ascii="Wingdings" w:hAnsi="Wingdings" w:hint="default"/>
+        <w:rFonts w:hint="default" w:ascii="Wingdings" w:hAnsi="Wingdings"/>
       </w:rPr>
     </w:lvl>
     <w:lvl w:ilvl="3" w:tplc="6ABC06A4">
@@ -2348,7 +2749,7 @@
         <w:ind w:left="2880" w:hanging="360"/>
       </w:pPr>
       <w:rPr>
-        <w:rFonts w:ascii="Symbol" w:hAnsi="Symbol" w:hint="default"/>
+        <w:rFonts w:hint="default" w:ascii="Symbol" w:hAnsi="Symbol"/>
       </w:rPr>
     </w:lvl>
     <w:lvl w:ilvl="4" w:tplc="04CC6E7A">
@@ -2360,7 +2761,7 @@
         <w:ind w:left="3600" w:hanging="360"/>
       </w:pPr>
       <w:rPr>
-        <w:rFonts w:ascii="Courier New" w:hAnsi="Courier New" w:hint="default"/>
+        <w:rFonts w:hint="default" w:ascii="Courier New" w:hAnsi="Courier New"/>
       </w:rPr>
     </w:lvl>
     <w:lvl w:ilvl="5" w:tplc="C3E48394">
@@ -2372,7 +2773,7 @@
         <w:ind w:left="4320" w:hanging="360"/>
       </w:pPr>
       <w:rPr>
-        <w:rFonts w:ascii="Wingdings" w:hAnsi="Wingdings" w:hint="default"/>
+        <w:rFonts w:hint="default" w:ascii="Wingdings" w:hAnsi="Wingdings"/>
       </w:rPr>
     </w:lvl>
     <w:lvl w:ilvl="6" w:tplc="36DADB68">
@@ -2384,7 +2785,7 @@
         <w:ind w:left="5040" w:hanging="360"/>
       </w:pPr>
       <w:rPr>
-        <w:rFonts w:ascii="Symbol" w:hAnsi="Symbol" w:hint="default"/>
+        <w:rFonts w:hint="default" w:ascii="Symbol" w:hAnsi="Symbol"/>
       </w:rPr>
     </w:lvl>
     <w:lvl w:ilvl="7" w:tplc="DF1CEA1E">
@@ -2396,7 +2797,7 @@
         <w:ind w:left="5760" w:hanging="360"/>
       </w:pPr>
       <w:rPr>
-        <w:rFonts w:ascii="Courier New" w:hAnsi="Courier New" w:hint="default"/>
+        <w:rFonts w:hint="default" w:ascii="Courier New" w:hAnsi="Courier New"/>
       </w:rPr>
     </w:lvl>
     <w:lvl w:ilvl="8" w:tplc="237E14E2">
@@ -2408,7 +2809,7 @@
         <w:ind w:left="6480" w:hanging="360"/>
       </w:pPr>
       <w:rPr>
-        <w:rFonts w:ascii="Wingdings" w:hAnsi="Wingdings" w:hint="default"/>
+        <w:rFonts w:hint="default" w:ascii="Wingdings" w:hAnsi="Wingdings"/>
       </w:rPr>
     </w:lvl>
   </w:abstractNum>
@@ -2425,7 +2826,7 @@
         <w:ind w:left="720" w:hanging="360"/>
       </w:pPr>
       <w:rPr>
-        <w:rFonts w:ascii="Symbol" w:hAnsi="Symbol" w:hint="default"/>
+        <w:rFonts w:hint="default" w:ascii="Symbol" w:hAnsi="Symbol"/>
       </w:rPr>
     </w:lvl>
     <w:lvl w:ilvl="1" w:tplc="26028414">
@@ -2437,7 +2838,7 @@
         <w:ind w:left="1440" w:hanging="360"/>
       </w:pPr>
       <w:rPr>
-        <w:rFonts w:ascii="Courier New" w:hAnsi="Courier New" w:hint="default"/>
+        <w:rFonts w:hint="default" w:ascii="Courier New" w:hAnsi="Courier New"/>
       </w:rPr>
     </w:lvl>
     <w:lvl w:ilvl="2" w:tplc="98C0ACE6">
@@ -2449,7 +2850,7 @@
         <w:ind w:left="2160" w:hanging="360"/>
       </w:pPr>
       <w:rPr>
-        <w:rFonts w:ascii="Wingdings" w:hAnsi="Wingdings" w:hint="default"/>
+        <w:rFonts w:hint="default" w:ascii="Wingdings" w:hAnsi="Wingdings"/>
       </w:rPr>
     </w:lvl>
     <w:lvl w:ilvl="3" w:tplc="76564928">
@@ -2461,7 +2862,7 @@
         <w:ind w:left="2880" w:hanging="360"/>
       </w:pPr>
       <w:rPr>
-        <w:rFonts w:ascii="Symbol" w:hAnsi="Symbol" w:hint="default"/>
+        <w:rFonts w:hint="default" w:ascii="Symbol" w:hAnsi="Symbol"/>
       </w:rPr>
     </w:lvl>
     <w:lvl w:ilvl="4" w:tplc="E03E5D00">
@@ -2473,7 +2874,7 @@
         <w:ind w:left="3600" w:hanging="360"/>
       </w:pPr>
       <w:rPr>
-        <w:rFonts w:ascii="Courier New" w:hAnsi="Courier New" w:hint="default"/>
+        <w:rFonts w:hint="default" w:ascii="Courier New" w:hAnsi="Courier New"/>
       </w:rPr>
     </w:lvl>
     <w:lvl w:ilvl="5" w:tplc="51442D82">
@@ -2485,7 +2886,7 @@
         <w:ind w:left="4320" w:hanging="360"/>
       </w:pPr>
       <w:rPr>
-        <w:rFonts w:ascii="Wingdings" w:hAnsi="Wingdings" w:hint="default"/>
+        <w:rFonts w:hint="default" w:ascii="Wingdings" w:hAnsi="Wingdings"/>
       </w:rPr>
     </w:lvl>
     <w:lvl w:ilvl="6" w:tplc="5B0A2800">
@@ -2497,7 +2898,7 @@
         <w:ind w:left="5040" w:hanging="360"/>
       </w:pPr>
       <w:rPr>
-        <w:rFonts w:ascii="Symbol" w:hAnsi="Symbol" w:hint="default"/>
+        <w:rFonts w:hint="default" w:ascii="Symbol" w:hAnsi="Symbol"/>
       </w:rPr>
     </w:lvl>
     <w:lvl w:ilvl="7" w:tplc="EDD46DB2">
@@ -2509,7 +2910,7 @@
         <w:ind w:left="5760" w:hanging="360"/>
       </w:pPr>
       <w:rPr>
-        <w:rFonts w:ascii="Courier New" w:hAnsi="Courier New" w:hint="default"/>
+        <w:rFonts w:hint="default" w:ascii="Courier New" w:hAnsi="Courier New"/>
       </w:rPr>
     </w:lvl>
     <w:lvl w:ilvl="8" w:tplc="B4B628AE">
@@ -2521,7 +2922,7 @@
         <w:ind w:left="6480" w:hanging="360"/>
       </w:pPr>
       <w:rPr>
-        <w:rFonts w:ascii="Wingdings" w:hAnsi="Wingdings" w:hint="default"/>
+        <w:rFonts w:hint="default" w:ascii="Wingdings" w:hAnsi="Wingdings"/>
       </w:rPr>
     </w:lvl>
   </w:abstractNum>
@@ -2554,7 +2955,7 @@
   <w:docDefaults>
     <w:rPrDefault>
       <w:rPr>
-        <w:rFonts w:asciiTheme="minorHAnsi" w:eastAsiaTheme="minorEastAsia" w:hAnsiTheme="minorHAnsi" w:cstheme="minorBidi"/>
+        <w:rFonts w:asciiTheme="minorHAnsi" w:hAnsiTheme="minorHAnsi" w:eastAsiaTheme="minorEastAsia" w:cstheme="minorBidi"/>
         <w:sz w:val="24"/>
         <w:szCs w:val="24"/>
         <w:lang w:val="en-US" w:eastAsia="ja-JP" w:bidi="ar-SA"/>
@@ -2569,14 +2970,14 @@
   <w:latentStyles w:defLockedState="0" w:defUIPriority="99" w:defSemiHidden="0" w:defUnhideWhenUsed="0" w:defQFormat="0" w:count="376">
     <w:lsdException w:name="Normal" w:uiPriority="0" w:qFormat="1"/>
     <w:lsdException w:name="heading 1" w:uiPriority="9" w:qFormat="1"/>
-    <w:lsdException w:name="heading 2" w:semiHidden="1" w:uiPriority="9" w:unhideWhenUsed="1" w:qFormat="1"/>
-    <w:lsdException w:name="heading 3" w:semiHidden="1" w:uiPriority="9" w:unhideWhenUsed="1" w:qFormat="1"/>
-    <w:lsdException w:name="heading 4" w:semiHidden="1" w:uiPriority="9" w:unhideWhenUsed="1" w:qFormat="1"/>
-    <w:lsdException w:name="heading 5" w:semiHidden="1" w:uiPriority="9" w:unhideWhenUsed="1" w:qFormat="1"/>
-    <w:lsdException w:name="heading 6" w:semiHidden="1" w:uiPriority="9" w:unhideWhenUsed="1" w:qFormat="1"/>
-    <w:lsdException w:name="heading 7" w:semiHidden="1" w:uiPriority="9" w:unhideWhenUsed="1" w:qFormat="1"/>
-    <w:lsdException w:name="heading 8" w:semiHidden="1" w:uiPriority="9" w:unhideWhenUsed="1" w:qFormat="1"/>
-    <w:lsdException w:name="heading 9" w:semiHidden="1" w:uiPriority="9" w:unhideWhenUsed="1" w:qFormat="1"/>
+    <w:lsdException w:name="heading 2" w:uiPriority="9" w:semiHidden="1" w:unhideWhenUsed="1" w:qFormat="1"/>
+    <w:lsdException w:name="heading 3" w:uiPriority="9" w:semiHidden="1" w:unhideWhenUsed="1" w:qFormat="1"/>
+    <w:lsdException w:name="heading 4" w:uiPriority="9" w:semiHidden="1" w:unhideWhenUsed="1" w:qFormat="1"/>
+    <w:lsdException w:name="heading 5" w:uiPriority="9" w:semiHidden="1" w:unhideWhenUsed="1" w:qFormat="1"/>
+    <w:lsdException w:name="heading 6" w:uiPriority="9" w:semiHidden="1" w:unhideWhenUsed="1" w:qFormat="1"/>
+    <w:lsdException w:name="heading 7" w:uiPriority="9" w:semiHidden="1" w:unhideWhenUsed="1" w:qFormat="1"/>
+    <w:lsdException w:name="heading 8" w:uiPriority="9" w:semiHidden="1" w:unhideWhenUsed="1" w:qFormat="1"/>
+    <w:lsdException w:name="heading 9" w:uiPriority="9" w:semiHidden="1" w:unhideWhenUsed="1" w:qFormat="1"/>
     <w:lsdException w:name="index 1" w:semiHidden="1" w:unhideWhenUsed="1"/>
     <w:lsdException w:name="index 2" w:semiHidden="1" w:unhideWhenUsed="1"/>
     <w:lsdException w:name="index 3" w:semiHidden="1" w:unhideWhenUsed="1"/>
@@ -2586,22 +2987,22 @@
     <w:lsdException w:name="index 7" w:semiHidden="1" w:unhideWhenUsed="1"/>
     <w:lsdException w:name="index 8" w:semiHidden="1" w:unhideWhenUsed="1"/>
     <w:lsdException w:name="index 9" w:semiHidden="1" w:unhideWhenUsed="1"/>
-    <w:lsdException w:name="toc 1" w:semiHidden="1" w:uiPriority="39" w:unhideWhenUsed="1"/>
-    <w:lsdException w:name="toc 2" w:semiHidden="1" w:uiPriority="39" w:unhideWhenUsed="1"/>
-    <w:lsdException w:name="toc 3" w:semiHidden="1" w:uiPriority="39" w:unhideWhenUsed="1"/>
-    <w:lsdException w:name="toc 4" w:semiHidden="1" w:uiPriority="39" w:unhideWhenUsed="1"/>
-    <w:lsdException w:name="toc 5" w:semiHidden="1" w:uiPriority="39" w:unhideWhenUsed="1"/>
-    <w:lsdException w:name="toc 6" w:semiHidden="1" w:uiPriority="39" w:unhideWhenUsed="1"/>
-    <w:lsdException w:name="toc 7" w:semiHidden="1" w:uiPriority="39" w:unhideWhenUsed="1"/>
-    <w:lsdException w:name="toc 8" w:semiHidden="1" w:uiPriority="39" w:unhideWhenUsed="1"/>
-    <w:lsdException w:name="toc 9" w:semiHidden="1" w:uiPriority="39" w:unhideWhenUsed="1"/>
+    <w:lsdException w:name="toc 1" w:uiPriority="39" w:semiHidden="1" w:unhideWhenUsed="1"/>
+    <w:lsdException w:name="toc 2" w:uiPriority="39" w:semiHidden="1" w:unhideWhenUsed="1"/>
+    <w:lsdException w:name="toc 3" w:uiPriority="39" w:semiHidden="1" w:unhideWhenUsed="1"/>
+    <w:lsdException w:name="toc 4" w:uiPriority="39" w:semiHidden="1" w:unhideWhenUsed="1"/>
+    <w:lsdException w:name="toc 5" w:uiPriority="39" w:semiHidden="1" w:unhideWhenUsed="1"/>
+    <w:lsdException w:name="toc 6" w:uiPriority="39" w:semiHidden="1" w:unhideWhenUsed="1"/>
+    <w:lsdException w:name="toc 7" w:uiPriority="39" w:semiHidden="1" w:unhideWhenUsed="1"/>
+    <w:lsdException w:name="toc 8" w:uiPriority="39" w:semiHidden="1" w:unhideWhenUsed="1"/>
+    <w:lsdException w:name="toc 9" w:uiPriority="39" w:semiHidden="1" w:unhideWhenUsed="1"/>
     <w:lsdException w:name="Normal Indent" w:semiHidden="1" w:unhideWhenUsed="1"/>
     <w:lsdException w:name="footnote text" w:semiHidden="1" w:unhideWhenUsed="1"/>
     <w:lsdException w:name="annotation text" w:semiHidden="1" w:unhideWhenUsed="1"/>
     <w:lsdException w:name="header" w:semiHidden="1" w:unhideWhenUsed="1"/>
     <w:lsdException w:name="footer" w:semiHidden="1" w:unhideWhenUsed="1"/>
     <w:lsdException w:name="index heading" w:semiHidden="1" w:unhideWhenUsed="1"/>
-    <w:lsdException w:name="caption" w:semiHidden="1" w:uiPriority="35" w:unhideWhenUsed="1" w:qFormat="1"/>
+    <w:lsdException w:name="caption" w:uiPriority="35" w:semiHidden="1" w:unhideWhenUsed="1" w:qFormat="1"/>
     <w:lsdException w:name="table of figures" w:semiHidden="1" w:unhideWhenUsed="1"/>
     <w:lsdException w:name="envelope address" w:semiHidden="1" w:unhideWhenUsed="1"/>
     <w:lsdException w:name="envelope return" w:semiHidden="1" w:unhideWhenUsed="1"/>
@@ -2632,7 +3033,7 @@
     <w:lsdException w:name="Title" w:uiPriority="10" w:qFormat="1"/>
     <w:lsdException w:name="Closing" w:semiHidden="1" w:unhideWhenUsed="1"/>
     <w:lsdException w:name="Signature" w:semiHidden="1" w:unhideWhenUsed="1"/>
-    <w:lsdException w:name="Default Paragraph Font" w:semiHidden="1" w:uiPriority="1" w:unhideWhenUsed="1"/>
+    <w:lsdException w:name="Default Paragraph Font" w:uiPriority="1" w:semiHidden="1" w:unhideWhenUsed="1"/>
     <w:lsdException w:name="Body Text" w:semiHidden="1" w:unhideWhenUsed="1"/>
     <w:lsdException w:name="Body Text Indent" w:semiHidden="1" w:unhideWhenUsed="1"/>
     <w:lsdException w:name="List Continue" w:semiHidden="1" w:unhideWhenUsed="1"/>
@@ -2832,8 +3233,8 @@
     <w:lsdException w:name="Subtle Reference" w:uiPriority="31" w:qFormat="1"/>
     <w:lsdException w:name="Intense Reference" w:uiPriority="32" w:qFormat="1"/>
     <w:lsdException w:name="Book Title" w:uiPriority="33" w:qFormat="1"/>
-    <w:lsdException w:name="Bibliography" w:semiHidden="1" w:uiPriority="37" w:unhideWhenUsed="1"/>
-    <w:lsdException w:name="TOC Heading" w:semiHidden="1" w:uiPriority="39" w:unhideWhenUsed="1" w:qFormat="1"/>
+    <w:lsdException w:name="Bibliography" w:uiPriority="37" w:semiHidden="1" w:unhideWhenUsed="1"/>
+    <w:lsdException w:name="TOC Heading" w:uiPriority="39" w:semiHidden="1" w:unhideWhenUsed="1" w:qFormat="1"/>
     <w:lsdException w:name="Plain Table 1" w:uiPriority="41"/>
     <w:lsdException w:name="Plain Table 2" w:uiPriority="42"/>
     <w:lsdException w:name="Plain Table 3" w:uiPriority="43"/>
@@ -2944,7 +3345,7 @@
     <w:lsdException w:name="Unresolved Mention" w:semiHidden="1" w:unhideWhenUsed="1"/>
     <w:lsdException w:name="Smart Link" w:semiHidden="1" w:unhideWhenUsed="1"/>
   </w:latentStyles>
-  <w:style w:type="paragraph" w:default="1" w:styleId="Normal">
+  <w:style w:type="paragraph" w:styleId="Normal" w:default="1">
     <w:name w:val="Normal"/>
     <w:qFormat/>
   </w:style>
@@ -2962,7 +3363,7 @@
       <w:outlineLvl w:val="0"/>
     </w:pPr>
     <w:rPr>
-      <w:rFonts w:asciiTheme="majorHAnsi" w:eastAsiaTheme="majorEastAsia" w:hAnsiTheme="majorHAnsi" w:cstheme="majorBidi"/>
+      <w:rFonts w:asciiTheme="majorHAnsi" w:hAnsiTheme="majorHAnsi" w:eastAsiaTheme="majorEastAsia" w:cstheme="majorBidi"/>
       <w:color w:val="0F4761" w:themeColor="accent1" w:themeShade="BF"/>
       <w:sz w:val="40"/>
       <w:szCs w:val="40"/>
@@ -2983,7 +3384,7 @@
       <w:outlineLvl w:val="1"/>
     </w:pPr>
     <w:rPr>
-      <w:rFonts w:asciiTheme="majorHAnsi" w:eastAsiaTheme="majorEastAsia" w:hAnsiTheme="majorHAnsi" w:cstheme="majorBidi"/>
+      <w:rFonts w:asciiTheme="majorHAnsi" w:hAnsiTheme="majorHAnsi" w:eastAsiaTheme="majorEastAsia" w:cstheme="majorBidi"/>
       <w:color w:val="0F4761" w:themeColor="accent1" w:themeShade="BF"/>
       <w:sz w:val="32"/>
       <w:szCs w:val="32"/>
@@ -3130,13 +3531,13 @@
       <w:color w:val="272727" w:themeColor="text1" w:themeTint="D8"/>
     </w:rPr>
   </w:style>
-  <w:style w:type="character" w:default="1" w:styleId="DefaultParagraphFont">
+  <w:style w:type="character" w:styleId="DefaultParagraphFont" w:default="1">
     <w:name w:val="Default Paragraph Font"/>
     <w:uiPriority w:val="1"/>
     <w:semiHidden/>
     <w:unhideWhenUsed/>
   </w:style>
-  <w:style w:type="table" w:default="1" w:styleId="TableNormal">
+  <w:style w:type="table" w:styleId="TableNormal" w:default="1">
     <w:name w:val="Normal Table"/>
     <w:uiPriority w:val="99"/>
     <w:semiHidden/>
@@ -3151,37 +3552,37 @@
       </w:tblCellMar>
     </w:tblPr>
   </w:style>
-  <w:style w:type="numbering" w:default="1" w:styleId="NoList">
+  <w:style w:type="numbering" w:styleId="NoList" w:default="1">
     <w:name w:val="No List"/>
     <w:uiPriority w:val="99"/>
     <w:semiHidden/>
     <w:unhideWhenUsed/>
   </w:style>
-  <w:style w:type="character" w:customStyle="1" w:styleId="Heading1Char">
+  <w:style w:type="character" w:styleId="Heading1Char" w:customStyle="1">
     <w:name w:val="Heading 1 Char"/>
     <w:basedOn w:val="DefaultParagraphFont"/>
     <w:link w:val="Heading1"/>
     <w:uiPriority w:val="9"/>
     <w:rPr>
-      <w:rFonts w:asciiTheme="majorHAnsi" w:eastAsiaTheme="majorEastAsia" w:hAnsiTheme="majorHAnsi" w:cstheme="majorBidi"/>
+      <w:rFonts w:asciiTheme="majorHAnsi" w:hAnsiTheme="majorHAnsi" w:eastAsiaTheme="majorEastAsia" w:cstheme="majorBidi"/>
       <w:color w:val="0F4761" w:themeColor="accent1" w:themeShade="BF"/>
       <w:sz w:val="40"/>
       <w:szCs w:val="40"/>
     </w:rPr>
   </w:style>
-  <w:style w:type="character" w:customStyle="1" w:styleId="Heading2Char">
+  <w:style w:type="character" w:styleId="Heading2Char" w:customStyle="1">
     <w:name w:val="Heading 2 Char"/>
     <w:basedOn w:val="DefaultParagraphFont"/>
     <w:link w:val="Heading2"/>
     <w:uiPriority w:val="9"/>
     <w:rPr>
-      <w:rFonts w:asciiTheme="majorHAnsi" w:eastAsiaTheme="majorEastAsia" w:hAnsiTheme="majorHAnsi" w:cstheme="majorBidi"/>
+      <w:rFonts w:asciiTheme="majorHAnsi" w:hAnsiTheme="majorHAnsi" w:eastAsiaTheme="majorEastAsia" w:cstheme="majorBidi"/>
       <w:color w:val="0F4761" w:themeColor="accent1" w:themeShade="BF"/>
       <w:sz w:val="32"/>
       <w:szCs w:val="32"/>
     </w:rPr>
   </w:style>
-  <w:style w:type="character" w:customStyle="1" w:styleId="Heading3Char">
+  <w:style w:type="character" w:styleId="Heading3Char" w:customStyle="1">
     <w:name w:val="Heading 3 Char"/>
     <w:basedOn w:val="DefaultParagraphFont"/>
     <w:link w:val="Heading3"/>
@@ -3193,7 +3594,7 @@
       <w:szCs w:val="28"/>
     </w:rPr>
   </w:style>
-  <w:style w:type="character" w:customStyle="1" w:styleId="Heading4Char">
+  <w:style w:type="character" w:styleId="Heading4Char" w:customStyle="1">
     <w:name w:val="Heading 4 Char"/>
     <w:basedOn w:val="DefaultParagraphFont"/>
     <w:link w:val="Heading4"/>
@@ -3205,7 +3606,7 @@
       <w:color w:val="0F4761" w:themeColor="accent1" w:themeShade="BF"/>
     </w:rPr>
   </w:style>
-  <w:style w:type="character" w:customStyle="1" w:styleId="Heading5Char">
+  <w:style w:type="character" w:styleId="Heading5Char" w:customStyle="1">
     <w:name w:val="Heading 5 Char"/>
     <w:basedOn w:val="DefaultParagraphFont"/>
     <w:link w:val="Heading5"/>
@@ -3215,7 +3616,7 @@
       <w:color w:val="0F4761" w:themeColor="accent1" w:themeShade="BF"/>
     </w:rPr>
   </w:style>
-  <w:style w:type="character" w:customStyle="1" w:styleId="Heading6Char">
+  <w:style w:type="character" w:styleId="Heading6Char" w:customStyle="1">
     <w:name w:val="Heading 6 Char"/>
     <w:basedOn w:val="DefaultParagraphFont"/>
     <w:link w:val="Heading6"/>
@@ -3227,7 +3628,7 @@
       <w:color w:val="595959" w:themeColor="text1" w:themeTint="A6"/>
     </w:rPr>
   </w:style>
-  <w:style w:type="character" w:customStyle="1" w:styleId="Heading7Char">
+  <w:style w:type="character" w:styleId="Heading7Char" w:customStyle="1">
     <w:name w:val="Heading 7 Char"/>
     <w:basedOn w:val="DefaultParagraphFont"/>
     <w:link w:val="Heading7"/>
@@ -3237,7 +3638,7 @@
       <w:color w:val="595959" w:themeColor="text1" w:themeTint="A6"/>
     </w:rPr>
   </w:style>
-  <w:style w:type="character" w:customStyle="1" w:styleId="Heading8Char">
+  <w:style w:type="character" w:styleId="Heading8Char" w:customStyle="1">
     <w:name w:val="Heading 8 Char"/>
     <w:basedOn w:val="DefaultParagraphFont"/>
     <w:link w:val="Heading8"/>
@@ -3249,7 +3650,7 @@
       <w:color w:val="272727" w:themeColor="text1" w:themeTint="D8"/>
     </w:rPr>
   </w:style>
-  <w:style w:type="character" w:customStyle="1" w:styleId="Heading9Char">
+  <w:style w:type="character" w:styleId="Heading9Char" w:customStyle="1">
     <w:name w:val="Heading 9 Char"/>
     <w:basedOn w:val="DefaultParagraphFont"/>
     <w:link w:val="Heading9"/>
@@ -3259,13 +3660,13 @@
       <w:color w:val="272727" w:themeColor="text1" w:themeTint="D8"/>
     </w:rPr>
   </w:style>
-  <w:style w:type="character" w:customStyle="1" w:styleId="TitleChar">
+  <w:style w:type="character" w:styleId="TitleChar" w:customStyle="1">
     <w:name w:val="Title Char"/>
     <w:basedOn w:val="DefaultParagraphFont"/>
     <w:link w:val="Title"/>
     <w:uiPriority w:val="10"/>
     <w:rPr>
-      <w:rFonts w:asciiTheme="majorHAnsi" w:eastAsiaTheme="majorEastAsia" w:hAnsiTheme="majorHAnsi" w:cstheme="majorBidi"/>
+      <w:rFonts w:asciiTheme="majorHAnsi" w:hAnsiTheme="majorHAnsi" w:eastAsiaTheme="majorEastAsia" w:cstheme="majorBidi"/>
       <w:spacing w:val="-10"/>
       <w:kern w:val="28"/>
       <w:sz w:val="56"/>
@@ -3284,14 +3685,14 @@
       <w:contextualSpacing/>
     </w:pPr>
     <w:rPr>
-      <w:rFonts w:asciiTheme="majorHAnsi" w:eastAsiaTheme="majorEastAsia" w:hAnsiTheme="majorHAnsi" w:cstheme="majorBidi"/>
+      <w:rFonts w:asciiTheme="majorHAnsi" w:hAnsiTheme="majorHAnsi" w:eastAsiaTheme="majorEastAsia" w:cstheme="majorBidi"/>
       <w:spacing w:val="-10"/>
       <w:kern w:val="28"/>
       <w:sz w:val="56"/>
       <w:szCs w:val="56"/>
     </w:rPr>
   </w:style>
-  <w:style w:type="character" w:customStyle="1" w:styleId="SubtitleChar">
+  <w:style w:type="character" w:styleId="SubtitleChar" w:customStyle="1">
     <w:name w:val="Subtitle Char"/>
     <w:basedOn w:val="DefaultParagraphFont"/>
     <w:link w:val="Subtitle"/>
@@ -3335,7 +3736,7 @@
       <w:color w:val="0F4761" w:themeColor="accent1" w:themeShade="BF"/>
     </w:rPr>
   </w:style>
-  <w:style w:type="character" w:customStyle="1" w:styleId="QuoteChar">
+  <w:style w:type="character" w:styleId="QuoteChar" w:customStyle="1">
     <w:name w:val="Quote Char"/>
     <w:basedOn w:val="DefaultParagraphFont"/>
     <w:link w:val="Quote"/>
@@ -3363,7 +3764,7 @@
       <w:color w:val="404040" w:themeColor="text1" w:themeTint="BF"/>
     </w:rPr>
   </w:style>
-  <w:style w:type="character" w:customStyle="1" w:styleId="IntenseQuoteChar">
+  <w:style w:type="character" w:styleId="IntenseQuoteChar" w:customStyle="1">
     <w:name w:val="Intense Quote Char"/>
     <w:basedOn w:val="DefaultParagraphFont"/>
     <w:link w:val="IntenseQuote"/>
@@ -3383,8 +3784,8 @@
     <w:qFormat/>
     <w:pPr>
       <w:pBdr>
-        <w:top w:val="single" w:sz="4" w:space="10" w:color="0F4761" w:themeColor="accent1" w:themeShade="BF"/>
-        <w:bottom w:val="single" w:sz="4" w:space="10" w:color="0F4761" w:themeColor="accent1" w:themeShade="BF"/>
+        <w:top w:val="single" w:color="0F4761" w:themeColor="accent1" w:themeShade="BF" w:sz="4" w:space="10"/>
+        <w:bottom w:val="single" w:color="0F4761" w:themeColor="accent1" w:themeShade="BF" w:sz="4" w:space="10"/>
       </w:pBdr>
       <w:spacing w:before="360" w:after="360"/>
       <w:ind w:left="864" w:right="864"/>
@@ -3419,12 +3820,12 @@
     </w:pPr>
     <w:tblPr>
       <w:tblBorders>
-        <w:top w:val="single" w:sz="4" w:space="0" w:color="000000" w:themeColor="text1"/>
-        <w:left w:val="single" w:sz="4" w:space="0" w:color="000000" w:themeColor="text1"/>
-        <w:bottom w:val="single" w:sz="4" w:space="0" w:color="000000" w:themeColor="text1"/>
-        <w:right w:val="single" w:sz="4" w:space="0" w:color="000000" w:themeColor="text1"/>
-        <w:insideH w:val="single" w:sz="4" w:space="0" w:color="000000" w:themeColor="text1"/>
-        <w:insideV w:val="single" w:sz="4" w:space="0" w:color="000000" w:themeColor="text1"/>
+        <w:top w:val="single" w:color="000000" w:themeColor="text1" w:sz="4" w:space="0"/>
+        <w:left w:val="single" w:color="000000" w:themeColor="text1" w:sz="4" w:space="0"/>
+        <w:bottom w:val="single" w:color="000000" w:themeColor="text1" w:sz="4" w:space="0"/>
+        <w:right w:val="single" w:color="000000" w:themeColor="text1" w:sz="4" w:space="0"/>
+        <w:insideH w:val="single" w:color="000000" w:themeColor="text1" w:sz="4" w:space="0"/>
+        <w:insideV w:val="single" w:color="000000" w:themeColor="text1" w:sz="4" w:space="0"/>
       </w:tblBorders>
     </w:tblPr>
   </w:style>
@@ -3452,7 +3853,7 @@
 </file>
 
 <file path=word/theme/theme1.xml><?xml version="1.0" encoding="utf-8"?>
-<a:theme xmlns:a="http://schemas.openxmlformats.org/drawingml/2006/main" name="Office Theme">
+<a:theme xmlns:a="http://schemas.openxmlformats.org/drawingml/2006/main" xmlns:thm15="http://schemas.microsoft.com/office/thememl/2012/main" name="Office Theme">
   <a:themeElements>
     <a:clrScheme name="Office">
       <a:dk1>

</xml_diff>